<commit_message>
docs: publish updated S4D-TAM manuscript
</commit_message>
<xml_diff>
--- a/paper/S4D_TAM_draft_0830.docx
+++ b/paper/S4D_TAM_draft_0830.docx
@@ -188,30 +188,7 @@
         </w:rPr>
       </w:pPr>
       <w:r>
-        <w:rPr>
-          <w:rFonts w:ascii="Times New Roman" w:eastAsia="Times New Roman" w:hAnsi="Times New Roman" w:cs="Times New Roman"/>
-          <w:sz w:val="24"/>
-          <w:szCs w:val="24"/>
-        </w:rPr>
-        <w:t>We propose S4D-TAM (Semantic 4D Token Attention Map), a novel navigation system architecture for unmanned aerial vehicles (UAVs) operating in GNSS-degraded environments. Unlike classical methods that repeatedly analyze raw image streams, the proposed system transforms sensor data (RGB, thermal, IMU, GNSS) into a persistent map of semantic 4D tokens. Each token represents a spatial fragment or object instance and contains its geometry, semantic embedding, dynamics, observation history, and calibrated uncertainty. A hierarchical spatiotemporal transformer updates the world model, aligns it with reference maps, and forecasts occupancy in partially observable regions. The p</w:t>
-      </w:r>
-      <w:r>
-        <w:rPr>
-          <w:rFonts w:ascii="Times New Roman" w:eastAsia="Times New Roman" w:hAnsi="Times New Roman" w:cs="Times New Roman"/>
-          <w:sz w:val="24"/>
-          <w:szCs w:val="24"/>
-        </w:rPr>
-        <w:t>redictive map is then used by a </w:t>
-      </w:r>
-      <w:bookmarkStart w:id="0" w:name="_GoBack"/>
-      <w:bookmarkEnd w:id="0"/>
-      <w:r>
-        <w:rPr>
-          <w:rFonts w:ascii="Times New Roman" w:eastAsia="Times New Roman" w:hAnsi="Times New Roman" w:cs="Times New Roman"/>
-          <w:sz w:val="24"/>
-          <w:szCs w:val="24"/>
-        </w:rPr>
-        <w:t>planner that accounts for risk, energy cost, and information value of future observations. The proposed representation aims to reduce image processing redundancy, increase robustness to GNSS degradation, and enable decision-making based on persistent spatial memory rather than solely on the current sensor field of view. The article presents the system concept, literature review, mathematical description of the architecture, and a proposal for experimental validation methodology.</w:t>
+        <w:t>We propose S4D-TAM (Semantic 4D Token Attention Map), a novel navigation system architecture for unmanned aerial vehicles (UAVs) operating in GNSS-degraded environments. Unlike classical methods that repeatedly analyze raw image streams, the proposed system transforms sensor data (RGB, thermal, IMU, GNSS) into a persistent map of semantic 4D tokens. Each token represents a spatial fragment or object instance and contains its geometry, semantic embedding, dynamics, observation history, and calibrated uncertainty. A hierarchical spatiotemporal transformer updates the world model, aligns it with reference maps, and forecasts occupancy in partially observable regions. The predictive map is then used by a planner that accounts for risk, energy cost, and information value of future observations. The proposed representation aims to reduce image processing redundancy, increase robustness to GNSS degradation, and enable decision-making based on persistent spatial memory rather than solely on the current sensor field of view. The article presents the system concept, literature review, mathematical description, an executable auditable reference implementation, and a two-level experimental methodology separating external system comparison from internal mechanism ablation. Confirmatory experimental results are not yet reported.</w:t>
       </w:r>
     </w:p>
     <w:p>
@@ -427,6 +404,17 @@
     </w:p>
     <w:p>
       <w:pPr>
+        <w:ind w:left="360"/>
+      </w:pPr>
+      <w:r>
+        <w:rPr>
+          <w:rFonts w:ascii="Times New Roman" w:hAnsi="Times New Roman"/>
+        </w:rPr>
+        <w:t>4.3. Current Reference Implementation and Target Research Modules</w:t>
+      </w:r>
+    </w:p>
+    <w:p>
+      <w:pPr>
         <w:spacing w:after="40" w:line="240" w:lineRule="auto"/>
         <w:rPr>
           <w:rFonts w:ascii="Times New Roman" w:hAnsi="Times New Roman" w:cs="Times New Roman"/>
@@ -717,10 +705,29 @@
         </w:rPr>
       </w:pPr>
       <w:r>
-        <w:rPr>
-          <w:rFonts w:ascii="Times New Roman" w:eastAsia="Times New Roman" w:hAnsi="Times New Roman" w:cs="Times New Roman"/>
-        </w:rPr>
-        <w:t>7.2. System Variants</w:t>
+        <w:t>7.2. Two-Level Comparison Design</w:t>
+      </w:r>
+    </w:p>
+    <w:p>
+      <w:pPr>
+        <w:ind w:left="720"/>
+      </w:pPr>
+      <w:r>
+        <w:rPr>
+          <w:rFonts w:ascii="Times New Roman" w:hAnsi="Times New Roman"/>
+        </w:rPr>
+        <w:t>7.2.1. External System Comparison</w:t>
+      </w:r>
+    </w:p>
+    <w:p>
+      <w:pPr>
+        <w:ind w:left="720"/>
+      </w:pPr>
+      <w:r>
+        <w:rPr>
+          <w:rFonts w:ascii="Times New Roman" w:hAnsi="Times New Roman"/>
+        </w:rPr>
+        <w:t>7.2.2. Internal Mechanism Study</w:t>
       </w:r>
     </w:p>
     <w:p>
@@ -736,6 +743,17 @@
           <w:rFonts w:ascii="Times New Roman" w:eastAsia="Times New Roman" w:hAnsi="Times New Roman" w:cs="Times New Roman"/>
         </w:rPr>
         <w:t>7.3. Metrics</w:t>
+      </w:r>
+    </w:p>
+    <w:p>
+      <w:pPr>
+        <w:ind w:left="360"/>
+      </w:pPr>
+      <w:r>
+        <w:rPr>
+          <w:rFonts w:ascii="Times New Roman" w:hAnsi="Times New Roman"/>
+        </w:rPr>
+        <w:t>7.4. Confirmatory Protocol and Statistical Analysis</w:t>
       </w:r>
     </w:p>
     <w:p>
@@ -907,13 +925,7 @@
         </w:rPr>
       </w:pPr>
       <w:r>
-        <w:rPr>
-          <w:rFonts w:ascii="Times New Roman" w:eastAsia="Times New Roman" w:hAnsi="Times New Roman" w:cs="Times New Roman"/>
-          <w:sz w:val="24"/>
-          <w:szCs w:val="24"/>
-        </w:rPr>
-        <w:lastRenderedPageBreak/>
-        <w:t>The article is conceptual and theoretical in character, presenting a new system architecture together with a literature review and mathematical description, without experimental results. The paper is organized as follows. Section 2 reviews the literature on semantic SLAM for UAVs, point cloud transformers, 4D occupancy forecasting, world models and planning, and navigation in GNSS-denied environments. Section 3 identifies the research gap and motivation. Section 4 presents the S4D-TAM system concept and the definition of the 4D token. Section 5 provides a detailed mathematical description of the architecture. Section 6 formulates research hypotheses. Section 7 proposes an experimental validation methodology. Sections 8 and 9 contain the discussion and conclusions.</w:t>
+        <w:t>The article combines a conceptual system architecture with an executable research reference and a reproducible benchmark framework. The current repository implements token state and lifecycle management, proposal and association, multimodal encoder interfaces, attention-related processing, uncertainty calibration utilities, reference-map and topological support, causal occupancy and motion forecasting, deterministic risk-aware planning, telemetry, and the integrated S4DTAMReference execution path. The final learned hierarchical model, full public-dataset reproduction, and confirmatory results remain under development. Section 7 therefore specifies a prospective two-level validation protocol rather than reporting final performance results.</w:t>
       </w:r>
     </w:p>
     <w:p>
@@ -2412,6 +2424,41 @@
           <w:szCs w:val="24"/>
         </w:rPr>
         <w:t>Layer 9: Active Perception The active perception module selects camera orientation, processing frequency, and sensory modality based on expected uncertainty reduction relative to cost. The IR camera may be activated more frequently in low illumination or in areas where prior data indicates the possible presence of a thermal object. The RGB camera need not be analyzed by the full network at every frame [1], [3], [6].</w:t>
+      </w:r>
+    </w:p>
+    <w:p>
+      <w:pPr/>
+      <w:r>
+        <w:rPr>
+          <w:rFonts w:ascii="Times New Roman" w:hAnsi="Times New Roman"/>
+          <w:b/>
+          <w:sz w:val="24"/>
+        </w:rPr>
+        <w:t>4.3. Current Reference Implementation and Target Research Modules</w:t>
+      </w:r>
+    </w:p>
+    <w:p>
+      <w:pPr/>
+      <w:r>
+        <w:t>The S4D-TAM concept is accompanied by an executable Python research reference. The implementation is intentionally modular so that individual mechanisms can be tested, replaced, and ablated without changing the evaluator boundary.</w:t>
+      </w:r>
+    </w:p>
+    <w:p>
+      <w:pPr/>
+      <w:r>
+        <w:t>Implemented reference components include persistent token state and lifecycle management (token.py, memory.py), token proposal and data association (proposal.py, association.py), modality-oriented encoder interfaces and masked fusion (encoders/), attention-related processing (attention.py), calibration and uncertainty utilities (calibration.py), reference-map and topological support (reference_map.py, topology.py), causal probabilistic occupancy and motion forecasting (forecasting.py), deterministic risk-, energy-, time-, progress-, and information-aware planning (planner.py), structured event telemetry (telemetry.py), and the integrated S4DTAMReference pipeline (pipeline.py).</w:t>
+      </w:r>
+    </w:p>
+    <w:p>
+      <w:pPr/>
+      <w:r>
+        <w:t>The reference implementation favors causality, deterministic replay, explicit uncertainty, and auditability over maximum throughput. This is advantageous during early numerical validation because an observed difference can be traced to a defined mechanism rather than hidden implementation nondeterminism.</w:t>
+      </w:r>
+    </w:p>
+    <w:p>
+      <w:pPr/>
+      <w:r>
+        <w:t>Several formulations in Sections 5.12-5.15 describe target research extensions rather than already completed backends. These include a learned hierarchical spatiotemporal model, a DBN/particle or equivalent multimodal probabilistic scene-state backend, an MPPI planner backend, adaptive octree/LOD storage, a closed-loop active-perception controller, and a safety-aware real-time scheduler. They are maintained as explicit implementation milestones and must preserve the same causal and evaluator-facing contracts when introduced.</w:t>
       </w:r>
     </w:p>
     <w:p>
@@ -8133,6 +8180,11 @@
       </w:r>
     </w:p>
     <w:p>
+      <w:r>
+        <w:t>Implementation status. The current executable reference uses a strictly causal probabilistic occupancy and motion forecaster driven only by observations available up to the prediction time. It produces Bernoulli occupancy probabilities, flow means, uncertainty estimates, observability masks, and physically timed forecast horizons, including irregular or dropped samples. This deterministic causal baseline is preferred for initial validation because future-frame leakage is structurally impossible. The DBN and particle approximation below define the target probabilistic extension for multimodal future-state uncertainty and are not claimed as the current default backend.</w:t>
+      </w:r>
+    </w:p>
+    <w:p>
       <w:pPr>
         <w:spacing w:after="120" w:line="240" w:lineRule="auto"/>
         <w:jc w:val="both"/>
@@ -8741,6 +8793,11 @@
       </w:r>
     </w:p>
     <w:p>
+      <w:r>
+        <w:t>Implementation status. The executable reference planner currently uses deterministic finite-horizon beam search over admissible acceleration controls with explicit kinematic limits and decomposed collision-risk, energy, time, goal-progress, and information-value terms. This approach is more auditable than stochastic sampling for early confirmatory experiments because identical inputs generate the same candidate evaluation and decision trace. MPPI remains a planned backend for richer dynamics and will be introduced behind the same planner contract only after direct comparison with the deterministic reference.</w:t>
+      </w:r>
+    </w:p>
+    <w:p>
       <w:pPr>
         <w:spacing w:after="120" w:line="240" w:lineRule="auto"/>
         <w:jc w:val="both"/>
@@ -9254,12 +9311,7 @@
         </w:rPr>
       </w:pPr>
       <w:r>
-        <w:rPr>
-          <w:rFonts w:ascii="Times New Roman" w:eastAsia="Times New Roman" w:hAnsi="Times New Roman" w:cs="Times New Roman"/>
-          <w:sz w:val="24"/>
-          <w:szCs w:val="24"/>
-        </w:rPr>
-        <w:t>where ℱ is the space of feasible trajectories (kinematic and dynamic UAV constraints). Since direct minimization of the expected value is computationally expensive, approximation by particle trajectory sampling via MPPI (Model Predictive Path Integral) is employed:</w:t>
+        <w:t>For a future high-dimensional stochastic planning backend, direct minimization of the expected value may be approximated by particle trajectory sampling via MPPI (Model Predictive Path Integral). The following formulation defines that target extension; it is not required by the current deterministic reference planner:</w:t>
       </w:r>
     </w:p>
     <w:p>
@@ -9400,6 +9452,11 @@
       </w:r>
     </w:p>
     <w:p>
+      <w:r>
+        <w:t>Implementation status. The current token memory already enforces bounded history and configurable limits on token count, map memory, and update time, together with lifecycle activation, sleeping, reactivation, merging, and removal rules. These mechanisms implement the resource-bounded principle of this section. The full adaptive octree and Level-of-Detail storage policy described below remains a planned world-model backend and will be validated separately before becoming the default representation.</w:t>
+      </w:r>
+    </w:p>
+    <w:p>
       <w:pPr>
         <w:spacing w:after="120" w:line="240" w:lineRule="auto"/>
         <w:jc w:val="both"/>
@@ -10059,6 +10116,11 @@
           <w:szCs w:val="24"/>
         </w:rPr>
         <w:t>5.15. Computational Resource Management and Bottleneck Elimination</w:t>
+      </w:r>
+    </w:p>
+    <w:p>
+      <w:r>
+        <w:t>Implementation status. Structured telemetry and resource budgets already expose update-time, token-count, memory, lifecycle, and decision events needed for profiling and replay. Predictive queue-overflow control, EDF-RT scheduling, guaranteed safety-critical CPU reservations, and the full survival-mode controller described below remain planned real-time systems extensions rather than features of the current Python reference.</w:t>
       </w:r>
     </w:p>
     <w:p>
@@ -10710,155 +10772,57 @@
       </w:r>
     </w:p>
     <w:p>
-      <w:pPr>
-        <w:spacing w:after="120" w:line="240" w:lineRule="auto"/>
-        <w:jc w:val="both"/>
-        <w:rPr>
-          <w:rFonts w:ascii="Times New Roman" w:hAnsi="Times New Roman" w:cs="Times New Roman"/>
-          <w:sz w:val="24"/>
-          <w:szCs w:val="24"/>
-        </w:rPr>
-      </w:pPr>
-      <w:r>
-        <w:rPr>
-          <w:rFonts w:ascii="Times New Roman" w:eastAsia="Times New Roman" w:hAnsi="Times New Roman" w:cs="Times New Roman"/>
-          <w:sz w:val="24"/>
-          <w:szCs w:val="24"/>
-        </w:rPr>
-        <w:t>We propose the following research hypotheses for experimental verification:</w:t>
-      </w:r>
-    </w:p>
-    <w:p>
-      <w:pPr>
-        <w:spacing w:after="120" w:line="240" w:lineRule="auto"/>
-        <w:jc w:val="both"/>
-        <w:rPr>
-          <w:rFonts w:ascii="Times New Roman" w:hAnsi="Times New Roman" w:cs="Times New Roman"/>
-          <w:sz w:val="24"/>
-          <w:szCs w:val="24"/>
-        </w:rPr>
-      </w:pPr>
-      <w:r>
-        <w:rPr>
-          <w:rFonts w:ascii="Times New Roman" w:eastAsia="Times New Roman" w:hAnsi="Times New Roman" w:cs="Times New Roman"/>
-          <w:sz w:val="24"/>
-          <w:szCs w:val="24"/>
-        </w:rPr>
-        <w:t>H1: Navigation based on persistent 4D map tokens requires fewer operations and less memory than a system that repeatedly analyzes full RGB and IR sequences.</w:t>
-      </w:r>
-    </w:p>
-    <w:p>
-      <w:pPr>
-        <w:spacing w:after="120" w:line="240" w:lineRule="auto"/>
-        <w:jc w:val="both"/>
-        <w:rPr>
-          <w:rFonts w:ascii="Times New Roman" w:hAnsi="Times New Roman" w:cs="Times New Roman"/>
-          <w:sz w:val="24"/>
-          <w:szCs w:val="24"/>
-        </w:rPr>
-      </w:pPr>
-      <w:r>
-        <w:rPr>
-          <w:rFonts w:ascii="Times New Roman" w:eastAsia="Times New Roman" w:hAnsi="Times New Roman" w:cs="Times New Roman"/>
-          <w:sz w:val="24"/>
-          <w:szCs w:val="24"/>
-        </w:rPr>
-        <w:t>H2: Adding semantic embeddings to the geometric SLAM map reduces re-localization error in environments containing repetitive geometric structures.</w:t>
-      </w:r>
-    </w:p>
-    <w:p>
-      <w:pPr>
-        <w:spacing w:after="120" w:line="240" w:lineRule="auto"/>
-        <w:jc w:val="both"/>
-        <w:rPr>
-          <w:rFonts w:ascii="Times New Roman" w:hAnsi="Times New Roman" w:cs="Times New Roman"/>
-          <w:sz w:val="24"/>
-          <w:szCs w:val="24"/>
-        </w:rPr>
-      </w:pPr>
-      <w:r>
-        <w:rPr>
-          <w:rFonts w:ascii="Times New Roman" w:eastAsia="Times New Roman" w:hAnsi="Times New Roman" w:cs="Times New Roman"/>
-          <w:sz w:val="24"/>
-          <w:szCs w:val="24"/>
-        </w:rPr>
-        <w:t>H3: The temporal token model improves future occupancy prediction relative to a static 3D map.</w:t>
-      </w:r>
-    </w:p>
-    <w:p>
-      <w:pPr>
-        <w:spacing w:after="120" w:line="240" w:lineRule="auto"/>
-        <w:jc w:val="both"/>
-        <w:rPr>
-          <w:rFonts w:ascii="Times New Roman" w:hAnsi="Times New Roman" w:cs="Times New Roman"/>
-          <w:sz w:val="24"/>
-          <w:szCs w:val="24"/>
-        </w:rPr>
-      </w:pPr>
-      <w:r>
-        <w:rPr>
-          <w:rFonts w:ascii="Times New Roman" w:eastAsia="Times New Roman" w:hAnsi="Times New Roman" w:cs="Times New Roman"/>
-          <w:sz w:val="24"/>
-          <w:szCs w:val="24"/>
-        </w:rPr>
-        <w:t>H4: Incorporating token uncertainty reduces the number of false responses to unconfirmed observations.</w:t>
-      </w:r>
-    </w:p>
-    <w:p>
-      <w:pPr>
-        <w:spacing w:after="120" w:line="240" w:lineRule="auto"/>
-        <w:jc w:val="both"/>
-        <w:rPr>
-          <w:rFonts w:ascii="Times New Roman" w:hAnsi="Times New Roman" w:cs="Times New Roman"/>
-          <w:sz w:val="24"/>
-          <w:szCs w:val="24"/>
-        </w:rPr>
-      </w:pPr>
-      <w:r>
-        <w:rPr>
-          <w:rFonts w:ascii="Times New Roman" w:eastAsia="Times New Roman" w:hAnsi="Times New Roman" w:cs="Times New Roman"/>
-          <w:sz w:val="24"/>
-          <w:szCs w:val="24"/>
-        </w:rPr>
-        <w:t>H5: Comparing the local token map with the reference map increases localization robustness to periodic GNSS loss or inconsistency.</w:t>
-      </w:r>
-    </w:p>
-    <w:p>
-      <w:pPr>
-        <w:spacing w:after="120" w:line="240" w:lineRule="auto"/>
-        <w:jc w:val="both"/>
-        <w:rPr>
-          <w:rFonts w:ascii="Times New Roman" w:hAnsi="Times New Roman" w:cs="Times New Roman"/>
-          <w:sz w:val="24"/>
-          <w:szCs w:val="24"/>
-        </w:rPr>
-      </w:pPr>
-      <w:r>
-        <w:rPr>
-          <w:rFonts w:ascii="Times New Roman" w:eastAsia="Times New Roman" w:hAnsi="Times New Roman" w:cs="Times New Roman"/>
-          <w:sz w:val="24"/>
-          <w:szCs w:val="24"/>
-        </w:rPr>
-        <w:t>H6: Topological descriptors of local sub-clouds improve map matching under changes in point density and partial occlusions.</w:t>
-      </w:r>
-    </w:p>
-    <w:p>
-      <w:pPr>
-        <w:spacing w:after="120" w:line="240" w:lineRule="auto"/>
-        <w:jc w:val="both"/>
-        <w:rPr>
-          <w:rFonts w:ascii="Times New Roman" w:hAnsi="Times New Roman" w:cs="Times New Roman"/>
-          <w:sz w:val="24"/>
-          <w:szCs w:val="24"/>
-        </w:rPr>
-      </w:pPr>
-      <w:r>
-        <w:rPr>
-          <w:rFonts w:ascii="Times New Roman" w:eastAsia="Times New Roman" w:hAnsi="Times New Roman" w:cs="Times New Roman"/>
-          <w:sz w:val="24"/>
-          <w:szCs w:val="24"/>
-        </w:rPr>
-        <w:t>H7: Planning using the predicted risk map increases the probability of safely completing a route in a partially observable environment.</w:t>
+      <w:pPr/>
+      <w:r>
+        <w:t>The confirmatory mechanism study uses seven preregistered hypotheses. Each hypothesis compares the full S4D-TAM model with a variant that disables exactly one mechanism while data, seeds, preprocessing, optimization budget, and all other settings remain fixed. External systems are deliberately excluded from this causal ablation family.</w:t>
+      </w:r>
+    </w:p>
+    <w:p>
+      <w:pPr/>
+      <w:r>
+        <w:t>H1: Semantics improve navigation in scenarios containing dynamic objects. The primary endpoint is mission success; collisions per kilometer and semantic mIoU are secondary outcomes.</w:t>
+      </w:r>
+    </w:p>
+    <w:p>
+      <w:pPr/>
+      <w:r>
+        <w:t>H2: Temporal state improves 1 s future-state prediction. The primary endpoint is forecast occupancy IoU at 1 s; flow EPE and temporal flip rate are secondary outcomes.</w:t>
+      </w:r>
+    </w:p>
+    <w:p>
+      <w:pPr/>
+      <w:r>
+        <w:t>H3: Calibrated uncertainty reduces navigation risk. The primary endpoint is collisions per kilometer; ECE, NLL, and near misses are secondary outcomes.</w:t>
+      </w:r>
+    </w:p>
+    <w:p>
+      <w:pPr/>
+      <w:r>
+        <w:t>H4: Topological support increases mission success. Path efficiency and ATE RMSE are secondary outcomes.</w:t>
+      </w:r>
+    </w:p>
+    <w:p>
+      <w:pPr/>
+      <w:r>
+        <w:t>H5: Reference-map support reduces localization error. The primary endpoint is ATE RMSE; RPE and final drift percentage are secondary outcomes.</w:t>
+      </w:r>
+    </w:p>
+    <w:p>
+      <w:pPr/>
+      <w:r>
+        <w:t>H6: Predictive risk modeling reduces collisions. The primary endpoint is collisions per kilometer; near misses and minimum clearance are secondary outcomes.</w:t>
+      </w:r>
+    </w:p>
+    <w:p>
+      <w:pPr/>
+      <w:r>
+        <w:t>H7: Token lifecycle management reduces computational cost without materially degrading navigation quality. Confirmation requires both lower p95 latency and non-inferior mission success with a preregistered margin of 2 percentage points; map bytes and peak RSS are secondary outcomes.</w:t>
+      </w:r>
+    </w:p>
+    <w:p>
+      <w:pPr/>
+      <w:r>
+        <w:t>H1-H6 are superiority hypotheses in the preregistered direction. H7 combines efficiency superiority with mission-success non-inferiority. The seven confirmatory decisions form one family and use the Holm procedure defined in Section 7.4.</w:t>
       </w:r>
     </w:p>
     <w:p>
@@ -10906,346 +10870,27 @@
       </w:r>
     </w:p>
     <w:p>
-      <w:pPr>
-        <w:spacing w:after="120" w:line="240" w:lineRule="auto"/>
-        <w:jc w:val="both"/>
-        <w:rPr>
-          <w:rFonts w:ascii="Times New Roman" w:hAnsi="Times New Roman" w:cs="Times New Roman"/>
-          <w:sz w:val="24"/>
-          <w:szCs w:val="24"/>
-        </w:rPr>
-      </w:pPr>
-      <w:r>
-        <w:rPr>
-          <w:rFonts w:ascii="Times New Roman" w:eastAsia="Times New Roman" w:hAnsi="Times New Roman" w:cs="Times New Roman"/>
-          <w:sz w:val="24"/>
-          <w:szCs w:val="24"/>
-        </w:rPr>
-        <w:t>For preliminary training, the following datasets can be used:</w:t>
-      </w:r>
-    </w:p>
-    <w:p>
-      <w:pPr>
-        <w:spacing w:after="80" w:line="240" w:lineRule="auto"/>
-        <w:ind w:left="360"/>
-        <w:jc w:val="both"/>
-        <w:rPr>
-          <w:rFonts w:ascii="Times New Roman" w:hAnsi="Times New Roman" w:cs="Times New Roman"/>
-          <w:sz w:val="24"/>
-          <w:szCs w:val="24"/>
-        </w:rPr>
-      </w:pPr>
-      <w:r>
-        <w:rPr>
-          <w:rFonts w:ascii="Times New Roman" w:eastAsia="Times New Roman" w:hAnsi="Times New Roman" w:cs="Times New Roman"/>
-          <w:sz w:val="24"/>
-          <w:szCs w:val="24"/>
-        </w:rPr>
-        <w:t xml:space="preserve">1. TartanAir </w:t>
-      </w:r>
-      <w:r>
-        <w:rPr>
-          <w:rFonts w:ascii="Times New Roman" w:eastAsia="Times New Roman" w:hAnsi="Times New Roman" w:cs="Times New Roman"/>
-          <w:sz w:val="24"/>
-          <w:szCs w:val="24"/>
-        </w:rPr>
-        <w:t>-</w:t>
-      </w:r>
-      <w:r>
-        <w:rPr>
-          <w:rFonts w:ascii="Times New Roman" w:eastAsia="Times New Roman" w:hAnsi="Times New Roman" w:cs="Times New Roman"/>
-          <w:sz w:val="24"/>
-          <w:szCs w:val="24"/>
-        </w:rPr>
-        <w:t xml:space="preserve"> contains RGB images, depth, segmentation, optical flow, camera poses, and LiDAR point clouds for diverse environments [24]</w:t>
-      </w:r>
-    </w:p>
-    <w:p>
-      <w:pPr>
-        <w:spacing w:after="80" w:line="240" w:lineRule="auto"/>
-        <w:ind w:left="360"/>
-        <w:jc w:val="both"/>
-        <w:rPr>
-          <w:rFonts w:ascii="Times New Roman" w:hAnsi="Times New Roman" w:cs="Times New Roman"/>
-          <w:sz w:val="24"/>
-          <w:szCs w:val="24"/>
-        </w:rPr>
-      </w:pPr>
-      <w:r>
-        <w:rPr>
-          <w:rFonts w:ascii="Times New Roman" w:eastAsia="Times New Roman" w:hAnsi="Times New Roman" w:cs="Times New Roman"/>
-          <w:sz w:val="24"/>
-          <w:szCs w:val="24"/>
-        </w:rPr>
-        <w:t xml:space="preserve">2. Blackbird </w:t>
-      </w:r>
-      <w:r>
-        <w:rPr>
-          <w:rFonts w:ascii="Times New Roman" w:eastAsia="Times New Roman" w:hAnsi="Times New Roman" w:cs="Times New Roman"/>
-          <w:sz w:val="24"/>
-          <w:szCs w:val="24"/>
-        </w:rPr>
-        <w:t>-</w:t>
-      </w:r>
-      <w:r>
-        <w:rPr>
-          <w:rFonts w:ascii="Times New Roman" w:eastAsia="Times New Roman" w:hAnsi="Times New Roman" w:cs="Times New Roman"/>
-          <w:sz w:val="24"/>
-          <w:szCs w:val="24"/>
-        </w:rPr>
-        <w:t xml:space="preserve"> suitable for evaluating perception during fast and dynamic UAV flight [44]</w:t>
-      </w:r>
-    </w:p>
-    <w:p>
-      <w:pPr>
-        <w:spacing w:after="80" w:line="240" w:lineRule="auto"/>
-        <w:ind w:left="360"/>
-        <w:jc w:val="both"/>
-        <w:rPr>
-          <w:rFonts w:ascii="Times New Roman" w:hAnsi="Times New Roman" w:cs="Times New Roman"/>
-          <w:sz w:val="24"/>
-          <w:szCs w:val="24"/>
-        </w:rPr>
-      </w:pPr>
-      <w:r>
-        <w:rPr>
-          <w:rFonts w:ascii="Times New Roman" w:eastAsia="Times New Roman" w:hAnsi="Times New Roman" w:cs="Times New Roman"/>
-          <w:sz w:val="24"/>
-          <w:szCs w:val="24"/>
-        </w:rPr>
-        <w:lastRenderedPageBreak/>
-        <w:t xml:space="preserve">3. MARSIM </w:t>
-      </w:r>
-      <w:r>
-        <w:rPr>
-          <w:rFonts w:ascii="Times New Roman" w:eastAsia="Times New Roman" w:hAnsi="Times New Roman" w:cs="Times New Roman"/>
-          <w:sz w:val="24"/>
-          <w:szCs w:val="24"/>
-        </w:rPr>
-        <w:t>-</w:t>
-      </w:r>
-      <w:r>
-        <w:rPr>
-          <w:rFonts w:ascii="Times New Roman" w:eastAsia="Times New Roman" w:hAnsi="Times New Roman" w:cs="Times New Roman"/>
-          <w:sz w:val="24"/>
-          <w:szCs w:val="24"/>
-        </w:rPr>
-        <w:t xml:space="preserve"> a lightweight realistic LiDAR-based UAV simulator [44]</w:t>
-      </w:r>
-    </w:p>
-    <w:p>
-      <w:pPr>
-        <w:spacing w:after="80" w:line="240" w:lineRule="auto"/>
-        <w:ind w:left="360"/>
-        <w:jc w:val="both"/>
-        <w:rPr>
-          <w:rFonts w:ascii="Times New Roman" w:hAnsi="Times New Roman" w:cs="Times New Roman"/>
-          <w:sz w:val="24"/>
-          <w:szCs w:val="24"/>
-        </w:rPr>
-      </w:pPr>
-      <w:r>
-        <w:rPr>
-          <w:rFonts w:ascii="Times New Roman" w:eastAsia="Times New Roman" w:hAnsi="Times New Roman" w:cs="Times New Roman"/>
-          <w:sz w:val="24"/>
-          <w:szCs w:val="24"/>
-        </w:rPr>
-        <w:t xml:space="preserve">4. Aeroverse </w:t>
-      </w:r>
-      <w:r>
-        <w:rPr>
-          <w:rFonts w:ascii="Times New Roman" w:eastAsia="Times New Roman" w:hAnsi="Times New Roman" w:cs="Times New Roman"/>
-          <w:sz w:val="24"/>
-          <w:szCs w:val="24"/>
-        </w:rPr>
-        <w:t>-</w:t>
-      </w:r>
-      <w:r>
-        <w:rPr>
-          <w:rFonts w:ascii="Times New Roman" w:eastAsia="Times New Roman" w:hAnsi="Times New Roman" w:cs="Times New Roman"/>
-          <w:sz w:val="24"/>
-          <w:szCs w:val="24"/>
-        </w:rPr>
-        <w:t xml:space="preserve"> a UAV-agent benchmark for simulation, pre-training, fine-tuning, and evaluation of world models [24]</w:t>
-      </w:r>
-    </w:p>
-    <w:p>
-      <w:pPr>
-        <w:spacing w:after="120" w:line="240" w:lineRule="auto"/>
-        <w:jc w:val="both"/>
-        <w:rPr>
-          <w:rFonts w:ascii="Times New Roman" w:hAnsi="Times New Roman" w:cs="Times New Roman"/>
-          <w:sz w:val="24"/>
-          <w:szCs w:val="24"/>
-        </w:rPr>
-      </w:pPr>
-      <w:r>
-        <w:rPr>
-          <w:rFonts w:ascii="Times New Roman" w:eastAsia="Times New Roman" w:hAnsi="Times New Roman" w:cs="Times New Roman"/>
-          <w:sz w:val="24"/>
-          <w:szCs w:val="24"/>
-        </w:rPr>
-        <w:t>The target dataset should be prepared specifically for UAVs and contain:</w:t>
-      </w:r>
-    </w:p>
-    <w:p>
-      <w:pPr>
-        <w:spacing w:after="80" w:line="240" w:lineRule="auto"/>
-        <w:ind w:left="360"/>
-        <w:jc w:val="both"/>
-        <w:rPr>
-          <w:rFonts w:ascii="Times New Roman" w:hAnsi="Times New Roman" w:cs="Times New Roman"/>
-          <w:sz w:val="24"/>
-          <w:szCs w:val="24"/>
-        </w:rPr>
-      </w:pPr>
-      <w:r>
-        <w:rPr>
-          <w:rFonts w:ascii="Times New Roman" w:eastAsia="Times New Roman" w:hAnsi="Times New Roman" w:cs="Times New Roman"/>
-          <w:sz w:val="24"/>
-          <w:szCs w:val="24"/>
-        </w:rPr>
-        <w:t>1. Synchronized RGB, IR, IMU, and GNSS</w:t>
-      </w:r>
-    </w:p>
-    <w:p>
-      <w:pPr>
-        <w:spacing w:after="80" w:line="240" w:lineRule="auto"/>
-        <w:ind w:left="360"/>
-        <w:jc w:val="both"/>
-        <w:rPr>
-          <w:rFonts w:ascii="Times New Roman" w:hAnsi="Times New Roman" w:cs="Times New Roman"/>
-          <w:sz w:val="24"/>
-          <w:szCs w:val="24"/>
-        </w:rPr>
-      </w:pPr>
-      <w:r>
-        <w:rPr>
-          <w:rFonts w:ascii="Times New Roman" w:eastAsia="Times New Roman" w:hAnsi="Times New Roman" w:cs="Times New Roman"/>
-          <w:sz w:val="24"/>
-          <w:szCs w:val="24"/>
-        </w:rPr>
-        <w:t>2. Reference trajectory</w:t>
-      </w:r>
-    </w:p>
-    <w:p>
-      <w:pPr>
-        <w:spacing w:after="80" w:line="240" w:lineRule="auto"/>
-        <w:ind w:left="360"/>
-        <w:jc w:val="both"/>
-        <w:rPr>
-          <w:rFonts w:ascii="Times New Roman" w:hAnsi="Times New Roman" w:cs="Times New Roman"/>
-          <w:sz w:val="24"/>
-          <w:szCs w:val="24"/>
-        </w:rPr>
-      </w:pPr>
-      <w:r>
-        <w:rPr>
-          <w:rFonts w:ascii="Times New Roman" w:eastAsia="Times New Roman" w:hAnsi="Times New Roman" w:cs="Times New Roman"/>
-          <w:sz w:val="24"/>
-          <w:szCs w:val="24"/>
-        </w:rPr>
-        <w:t>3. Point cloud</w:t>
-      </w:r>
-    </w:p>
-    <w:p>
-      <w:pPr>
-        <w:spacing w:after="80" w:line="240" w:lineRule="auto"/>
-        <w:ind w:left="360"/>
-        <w:jc w:val="both"/>
-        <w:rPr>
-          <w:rFonts w:ascii="Times New Roman" w:hAnsi="Times New Roman" w:cs="Times New Roman"/>
-          <w:sz w:val="24"/>
-          <w:szCs w:val="24"/>
-        </w:rPr>
-      </w:pPr>
-      <w:r>
-        <w:rPr>
-          <w:rFonts w:ascii="Times New Roman" w:eastAsia="Times New Roman" w:hAnsi="Times New Roman" w:cs="Times New Roman"/>
-          <w:sz w:val="24"/>
-          <w:szCs w:val="24"/>
-        </w:rPr>
-        <w:t>4. Elevation map</w:t>
-      </w:r>
-    </w:p>
-    <w:p>
-      <w:pPr>
-        <w:spacing w:after="80" w:line="240" w:lineRule="auto"/>
-        <w:ind w:left="360"/>
-        <w:jc w:val="both"/>
-        <w:rPr>
-          <w:rFonts w:ascii="Times New Roman" w:hAnsi="Times New Roman" w:cs="Times New Roman"/>
-          <w:sz w:val="24"/>
-          <w:szCs w:val="24"/>
-        </w:rPr>
-      </w:pPr>
-      <w:r>
-        <w:rPr>
-          <w:rFonts w:ascii="Times New Roman" w:eastAsia="Times New Roman" w:hAnsi="Times New Roman" w:cs="Times New Roman"/>
-          <w:sz w:val="24"/>
-          <w:szCs w:val="24"/>
-        </w:rPr>
-        <w:t>5. Static and dynamic labels</w:t>
-      </w:r>
-    </w:p>
-    <w:p>
-      <w:pPr>
-        <w:spacing w:after="80" w:line="240" w:lineRule="auto"/>
-        <w:ind w:left="360"/>
-        <w:jc w:val="both"/>
-        <w:rPr>
-          <w:rFonts w:ascii="Times New Roman" w:hAnsi="Times New Roman" w:cs="Times New Roman"/>
-          <w:sz w:val="24"/>
-          <w:szCs w:val="24"/>
-        </w:rPr>
-      </w:pPr>
-      <w:r>
-        <w:rPr>
-          <w:rFonts w:ascii="Times New Roman" w:eastAsia="Times New Roman" w:hAnsi="Times New Roman" w:cs="Times New Roman"/>
-          <w:sz w:val="24"/>
-          <w:szCs w:val="24"/>
-        </w:rPr>
-        <w:t>6. Visibility masks</w:t>
-      </w:r>
-    </w:p>
-    <w:p>
-      <w:pPr>
-        <w:spacing w:after="80" w:line="240" w:lineRule="auto"/>
-        <w:ind w:left="360"/>
-        <w:jc w:val="both"/>
-        <w:rPr>
-          <w:rFonts w:ascii="Times New Roman" w:hAnsi="Times New Roman" w:cs="Times New Roman"/>
-          <w:sz w:val="24"/>
-          <w:szCs w:val="24"/>
-        </w:rPr>
-      </w:pPr>
-      <w:r>
-        <w:rPr>
-          <w:rFonts w:ascii="Times New Roman" w:eastAsia="Times New Roman" w:hAnsi="Times New Roman" w:cs="Times New Roman"/>
-          <w:sz w:val="24"/>
-          <w:szCs w:val="24"/>
-        </w:rPr>
-        <w:t>7. Occluded area information</w:t>
-      </w:r>
-    </w:p>
-    <w:p>
-      <w:pPr>
-        <w:spacing w:after="80" w:line="240" w:lineRule="auto"/>
-        <w:ind w:left="360"/>
-        <w:jc w:val="both"/>
-        <w:rPr>
-          <w:rFonts w:ascii="Times New Roman" w:hAnsi="Times New Roman" w:cs="Times New Roman"/>
-          <w:sz w:val="24"/>
-          <w:szCs w:val="24"/>
-        </w:rPr>
-      </w:pPr>
-      <w:r>
-        <w:rPr>
-          <w:rFonts w:ascii="Times New Roman" w:eastAsia="Times New Roman" w:hAnsi="Times New Roman" w:cs="Times New Roman"/>
-          <w:sz w:val="24"/>
-          <w:szCs w:val="24"/>
-        </w:rPr>
-        <w:t>8. Individual sensor degradation scenarios</w:t>
+      <w:pPr/>
+      <w:r>
+        <w:t>The validation framework targets TartanAir, Blackbird, MARSIM, and AeroVerse, each converted to the common SequenceData contract with immutable source version, license record, coordinate convention, calibration metadata, and SHA-256 manifest. The cohort identifier frozen-2026-01 denotes the study cohort rather than a vendor release and must resolve to exact source versions and file hashes.</w:t>
+      </w:r>
+    </w:p>
+    <w:p>
+      <w:pPr/>
+      <w:r>
+        <w:t>Data are split at the environment or flight level, never by adjacent frames. The train split is the only source of learned weight updates; calibration is reserved for thresholds, normalization, early stopping, and uncertainty calibration; test remains inaccessible until code, artifacts, and analysis are frozen.</w:t>
+      </w:r>
+    </w:p>
+    <w:p>
+      <w:pPr/>
+      <w:r>
+        <w:t>The preregistered offline mechanism study uses 20 preselected test sequences per dataset, yielding 80 paired sequence-level units. Systems validation additionally defines 30 paired SIL scenarios with five seeds, 20 HIL scenarios with five seeds, and 20 paired controlled real-flight missions per variant when the safety gate remains open.</w:t>
+      </w:r>
+    </w:p>
+    <w:p>
+      <w:pPr/>
+      <w:r>
+        <w:t>A dedicated UAV dataset remains desirable for synchronized RGB, thermal, IMU, GNSS, point cloud, elevation/reference map, static and dynamic labels, visibility or observability masks, and controlled sensor-degradation scenarios. Metrics that require unavailable ground truth are reported as unavailable rather than silently omitted or imputed.</w:t>
       </w:r>
     </w:p>
     <w:p>
@@ -11260,851 +10905,162 @@
         </w:rPr>
       </w:pPr>
       <w:r>
-        <w:rPr>
-          <w:rFonts w:ascii="Times New Roman" w:eastAsia="Times New Roman" w:hAnsi="Times New Roman" w:cs="Times New Roman"/>
+        <w:t>7.2. Two-Level Comparison Design</w:t>
+      </w:r>
+    </w:p>
+    <w:p>
+      <w:pPr/>
+      <w:r>
+        <w:t>The evaluation is split into two non-interchangeable levels. Both levels use common dataset and metric contracts where applicable, but they answer different scientific questions and produce separate statistical reports.</w:t>
+      </w:r>
+    </w:p>
+    <w:p>
+      <w:pPr/>
+      <w:r>
+        <w:rPr>
+          <w:rFonts w:ascii="Times New Roman" w:hAnsi="Times New Roman"/>
+          <w:b/>
+        </w:rPr>
+        <w:t>7.2.1. External System Comparison</w:t>
+      </w:r>
+    </w:p>
+    <w:p>
+      <w:pPr/>
+      <w:r>
+        <w:t>The external comparison asks whether the complete S4D-TAM system is competitive with independently implemented navigation and SLAM systems under the same data, hardware policy, sensor availability, and evaluator definitions.</w:t>
+      </w:r>
+    </w:p>
+    <w:p>
+      <w:pPr/>
+      <w:r>
+        <w:t>The mandatory primary baseline set comprises ORB-SLAM3, VINS-Mono, FAST-LIO2, and LIO-SAM. Each baseline is pinned to an upstream revision and fixed environment or container, calibration, sensor-topic mapping, loop-closure policy, warm-up policy, and hardware configuration. Results enter the benchmark only through the common AlgorithmResult artifact schema.</w:t>
+      </w:r>
+    </w:p>
+    <w:p>
+      <w:pPr/>
+      <w:r>
+        <w:t>Additional external systems may be included only when their sensing assumptions are compatible, their exact implementation can be reproduced, and their output can be normalized without method-specific post-processing. Such additions must be frozen before the external study is executed.</w:t>
+      </w:r>
+    </w:p>
+    <w:p>
+      <w:pPr/>
+      <w:r>
+        <w:t>This level measures complete-system competitiveness. A difference relative to an external baseline cannot be interpreted as the causal effect of an individual S4D-TAM component.</w:t>
+      </w:r>
+    </w:p>
+    <w:p>
+      <w:pPr/>
+      <w:r>
+        <w:rPr>
+          <w:rFonts w:ascii="Times New Roman" w:hAnsi="Times New Roman"/>
+          <w:b/>
+        </w:rPr>
+        <w:t>7.2.2. Internal Mechanism Study</w:t>
+      </w:r>
+    </w:p>
+    <w:p>
+      <w:pPr/>
+      <w:r>
+        <w:t>The internal comparison tests mechanism contribution using the full system and seven single-component ablations: H1_no_semantics, H2_no_temporal_state, H3_no_calibrated_uncertainty, H4_no_topology, H5_no_reference_map, H6_no_risk_prediction, and H7_no_token_lifecycle.</w:t>
+      </w:r>
+    </w:p>
+    <w:p>
+      <w:pPr/>
+      <w:r>
+        <w:t>Each variant differs from full by exactly one switch and uses its own frozen trained artifact. External systems never appear in this matrix. This separation prevents confounding complete-system identity with the causal effect of removing one S4D-TAM mechanism.</w:t>
+      </w:r>
+    </w:p>
+    <w:p>
+      <w:pPr>
+        <w:spacing w:before="220" w:after="100" w:line="240" w:lineRule="auto"/>
+        <w:rPr>
+          <w:rFonts w:ascii="Times New Roman" w:hAnsi="Times New Roman" w:cs="Times New Roman"/>
           <w:b/>
           <w:bCs/>
           <w:sz w:val="24"/>
           <w:szCs w:val="24"/>
         </w:rPr>
-        <w:t>7.2. System Variants</w:t>
-      </w:r>
-    </w:p>
-    <w:p>
-      <w:pPr>
-        <w:spacing w:after="120" w:line="240" w:lineRule="auto"/>
-        <w:jc w:val="both"/>
-        <w:rPr>
-          <w:rFonts w:ascii="Times New Roman" w:hAnsi="Times New Roman" w:cs="Times New Roman"/>
-          <w:sz w:val="24"/>
-          <w:szCs w:val="24"/>
-        </w:rPr>
-      </w:pPr>
-      <w:r>
-        <w:rPr>
-          <w:rFonts w:ascii="Times New Roman" w:eastAsia="Times New Roman" w:hAnsi="Times New Roman" w:cs="Times New Roman"/>
-          <w:sz w:val="24"/>
-          <w:szCs w:val="24"/>
-        </w:rPr>
-        <w:t>The experiment should include the following variants:</w:t>
-      </w:r>
-    </w:p>
-    <w:p>
-      <w:pPr>
-        <w:spacing w:after="80" w:line="240" w:lineRule="auto"/>
-        <w:ind w:left="360"/>
-        <w:jc w:val="both"/>
-        <w:rPr>
-          <w:rFonts w:ascii="Times New Roman" w:hAnsi="Times New Roman" w:cs="Times New Roman"/>
-          <w:sz w:val="24"/>
-          <w:szCs w:val="24"/>
-        </w:rPr>
-      </w:pPr>
-      <w:r>
-        <w:rPr>
-          <w:rFonts w:ascii="Times New Roman" w:eastAsia="Times New Roman" w:hAnsi="Times New Roman" w:cs="Times New Roman"/>
-          <w:sz w:val="24"/>
-          <w:szCs w:val="24"/>
-        </w:rPr>
-        <w:t>1. Baseline 1: Classical SLAM with geometric planner</w:t>
-      </w:r>
-    </w:p>
-    <w:p>
-      <w:pPr>
-        <w:spacing w:after="80" w:line="240" w:lineRule="auto"/>
-        <w:ind w:left="360"/>
-        <w:jc w:val="both"/>
-        <w:rPr>
-          <w:rFonts w:ascii="Times New Roman" w:hAnsi="Times New Roman" w:cs="Times New Roman"/>
-          <w:sz w:val="24"/>
-          <w:szCs w:val="24"/>
-        </w:rPr>
-      </w:pPr>
-      <w:r>
-        <w:rPr>
-          <w:rFonts w:ascii="Times New Roman" w:eastAsia="Times New Roman" w:hAnsi="Times New Roman" w:cs="Times New Roman"/>
-          <w:sz w:val="24"/>
-          <w:szCs w:val="24"/>
-        </w:rPr>
-        <w:t>2. Baseline 2: SLAM with semantic segmentation</w:t>
-      </w:r>
-    </w:p>
-    <w:p>
-      <w:pPr>
-        <w:spacing w:after="80" w:line="240" w:lineRule="auto"/>
-        <w:ind w:left="360"/>
-        <w:jc w:val="both"/>
-        <w:rPr>
-          <w:rFonts w:ascii="Times New Roman" w:hAnsi="Times New Roman" w:cs="Times New Roman"/>
-          <w:sz w:val="24"/>
-          <w:szCs w:val="24"/>
-        </w:rPr>
-      </w:pPr>
-      <w:r>
-        <w:rPr>
-          <w:rFonts w:ascii="Times New Roman" w:eastAsia="Times New Roman" w:hAnsi="Times New Roman" w:cs="Times New Roman"/>
-          <w:sz w:val="24"/>
-          <w:szCs w:val="24"/>
-        </w:rPr>
-        <w:t>3. Baseline 3: Raw point cloud processed by transformer</w:t>
-      </w:r>
-    </w:p>
-    <w:p>
-      <w:pPr>
-        <w:spacing w:after="80" w:line="240" w:lineRule="auto"/>
-        <w:ind w:left="360"/>
-        <w:jc w:val="both"/>
-        <w:rPr>
-          <w:rFonts w:ascii="Times New Roman" w:hAnsi="Times New Roman" w:cs="Times New Roman"/>
-          <w:sz w:val="24"/>
-          <w:szCs w:val="24"/>
-        </w:rPr>
-      </w:pPr>
-      <w:r>
-        <w:rPr>
-          <w:rFonts w:ascii="Times New Roman" w:eastAsia="Times New Roman" w:hAnsi="Times New Roman" w:cs="Times New Roman"/>
-          <w:sz w:val="24"/>
-          <w:szCs w:val="24"/>
-        </w:rPr>
-        <w:t>4. Ablation 1: 3D tokens without temporal memory</w:t>
-      </w:r>
-    </w:p>
-    <w:p>
-      <w:pPr>
-        <w:spacing w:after="80" w:line="240" w:lineRule="auto"/>
-        <w:ind w:left="360"/>
-        <w:jc w:val="both"/>
-        <w:rPr>
-          <w:rFonts w:ascii="Times New Roman" w:hAnsi="Times New Roman" w:cs="Times New Roman"/>
-          <w:sz w:val="24"/>
-          <w:szCs w:val="24"/>
-        </w:rPr>
-      </w:pPr>
-      <w:r>
-        <w:rPr>
-          <w:rFonts w:ascii="Times New Roman" w:eastAsia="Times New Roman" w:hAnsi="Times New Roman" w:cs="Times New Roman"/>
-          <w:sz w:val="24"/>
-          <w:szCs w:val="24"/>
-        </w:rPr>
-        <w:t>5. Ablation 2: 4D tokens without reference map</w:t>
-      </w:r>
-    </w:p>
-    <w:p>
-      <w:pPr>
-        <w:spacing w:after="80" w:line="240" w:lineRule="auto"/>
-        <w:ind w:left="360"/>
-        <w:jc w:val="both"/>
-        <w:rPr>
-          <w:rFonts w:ascii="Times New Roman" w:hAnsi="Times New Roman" w:cs="Times New Roman"/>
-          <w:sz w:val="24"/>
-          <w:szCs w:val="24"/>
-        </w:rPr>
-      </w:pPr>
-      <w:r>
-        <w:rPr>
-          <w:rFonts w:ascii="Times New Roman" w:eastAsia="Times New Roman" w:hAnsi="Times New Roman" w:cs="Times New Roman"/>
-          <w:sz w:val="24"/>
-          <w:szCs w:val="24"/>
-        </w:rPr>
-        <w:t>6. Ablation 3: Full system without topological descriptors</w:t>
-      </w:r>
-    </w:p>
-    <w:p>
-      <w:pPr>
-        <w:spacing w:after="80" w:line="240" w:lineRule="auto"/>
-        <w:ind w:left="360"/>
-        <w:jc w:val="both"/>
-        <w:rPr>
-          <w:rFonts w:ascii="Times New Roman" w:hAnsi="Times New Roman" w:cs="Times New Roman"/>
-          <w:sz w:val="24"/>
-          <w:szCs w:val="24"/>
-        </w:rPr>
-      </w:pPr>
-      <w:r>
-        <w:rPr>
-          <w:rFonts w:ascii="Times New Roman" w:eastAsia="Times New Roman" w:hAnsi="Times New Roman" w:cs="Times New Roman"/>
-          <w:sz w:val="24"/>
-          <w:szCs w:val="24"/>
-        </w:rPr>
-        <w:t>7. Ablation 4: Full system without uncertainty modeling</w:t>
-      </w:r>
-    </w:p>
-    <w:p>
-      <w:pPr>
-        <w:spacing w:after="80" w:line="240" w:lineRule="auto"/>
-        <w:ind w:left="360"/>
-        <w:jc w:val="both"/>
-        <w:rPr>
-          <w:rFonts w:ascii="Times New Roman" w:hAnsi="Times New Roman" w:cs="Times New Roman"/>
-          <w:sz w:val="24"/>
-          <w:szCs w:val="24"/>
-        </w:rPr>
-      </w:pPr>
-      <w:r>
-        <w:rPr>
-          <w:rFonts w:ascii="Times New Roman" w:eastAsia="Times New Roman" w:hAnsi="Times New Roman" w:cs="Times New Roman"/>
-          <w:sz w:val="24"/>
-          <w:szCs w:val="24"/>
-        </w:rPr>
-        <w:t>8. Full S4D-TAM: Full system with all components</w:t>
-      </w:r>
-    </w:p>
-    <w:p>
-      <w:pPr>
-        <w:spacing w:before="220" w:after="100" w:line="240" w:lineRule="auto"/>
-        <w:rPr>
-          <w:rFonts w:ascii="Times New Roman" w:hAnsi="Times New Roman" w:cs="Times New Roman"/>
+      </w:pPr>
+      <w:r>
+        <w:rPr>
+          <w:rFonts w:ascii="Times New Roman" w:eastAsia="Times New Roman" w:hAnsi="Times New Roman" w:cs="Times New Roman"/>
           <w:b/>
           <w:bCs/>
           <w:sz w:val="24"/>
           <w:szCs w:val="24"/>
         </w:rPr>
-      </w:pPr>
-      <w:r>
-        <w:rPr>
-          <w:rFonts w:ascii="Times New Roman" w:eastAsia="Times New Roman" w:hAnsi="Times New Roman" w:cs="Times New Roman"/>
+        <w:t>7.3. Metrics</w:t>
+      </w:r>
+    </w:p>
+    <w:p>
+      <w:pPr/>
+      <w:r>
+        <w:t>Primary endpoints are deliberately compact and preregistered: localization uses ATE RMSE after SE(3) alignment without scale; forecasting uses occupancy IoU at 1 s and, for broader characterization, 3 s; safety uses mission success and collisions per kilometer; efficiency uses p95 latency and persistent map-memory footprint.</w:t>
+      </w:r>
+    </w:p>
+    <w:p>
+      <w:pPr/>
+      <w:r>
+        <w:t>Localization and SLAM secondary metrics include RPE translation RMSE, final drift in meters and percentage of reference path length, and rotation RPE when orientation ground truth is available. Relocalization success rate, time to relocalize, and post-relocalization pose error are reported when the dataset supports those events.</w:t>
+      </w:r>
+    </w:p>
+    <w:p>
+      <w:pPr/>
+      <w:r>
+        <w:t>Semantic metrics include mIoU and macro F1. Forecasting metrics include per-horizon occupancy IoU/F1, flow EPE, Brier score, NLL, and ECE. Pose uncertainty is evaluated by NEES, 95% coverage, and NLL where covariance output is available. Risk prediction may additionally report AUROC, false-alarm rate, and miss rate.</w:t>
+      </w:r>
+    </w:p>
+    <w:p>
+      <w:pPr/>
+      <w:r>
+        <w:t>Navigation metrics include mission success, collisions per kilometer, near misses, minimum clearance, and path efficiency. Efficiency metrics include latency p95, map bytes, peak RSS, CPU time, and implementation-specific telemetry such as processed-token counts when consistently available.</w:t>
+      </w:r>
+    </w:p>
+    <w:p>
+      <w:pPr/>
+      <w:r>
+        <w:t>Scale error, embedding quality, spatial-relation accuracy, emergency replanning counts, FPS, and energy consumption may be reported as secondary or exploratory metrics when their ground truth and measurement procedure are explicitly defined. They do not become confirmatory endpoints merely because an implementation emits them.</w:t>
+      </w:r>
+    </w:p>
+    <w:p>
+      <w:pPr/>
+      <w:r>
+        <w:t>A missing metric caused by absent ground truth or absent algorithm output is recorded as unavailable. Algorithm failure, timeout, abort, or collision is not treated as a missing observation and remains visible in the safety analysis.</w:t>
+      </w:r>
+    </w:p>
+    <w:p>
+      <w:pPr/>
+      <w:r>
+        <w:rPr>
+          <w:rFonts w:ascii="Times New Roman" w:hAnsi="Times New Roman"/>
           <w:b/>
-          <w:bCs/>
-          <w:sz w:val="24"/>
-          <w:szCs w:val="24"/>
-        </w:rPr>
-        <w:t>7.3. Metrics</w:t>
-      </w:r>
-    </w:p>
-    <w:p>
-      <w:pPr>
-        <w:spacing w:after="120" w:line="240" w:lineRule="auto"/>
-        <w:jc w:val="both"/>
-        <w:rPr>
-          <w:rFonts w:ascii="Times New Roman" w:hAnsi="Times New Roman" w:cs="Times New Roman"/>
-          <w:sz w:val="24"/>
-          <w:szCs w:val="24"/>
-        </w:rPr>
-      </w:pPr>
-      <w:r>
-        <w:rPr>
-          <w:rFonts w:ascii="Times New Roman" w:eastAsia="Times New Roman" w:hAnsi="Times New Roman" w:cs="Times New Roman"/>
-          <w:sz w:val="24"/>
-          <w:szCs w:val="24"/>
-        </w:rPr>
-        <w:t>Localization and SLAM:</w:t>
-      </w:r>
-    </w:p>
-    <w:p>
-      <w:pPr>
-        <w:spacing w:after="80" w:line="240" w:lineRule="auto"/>
-        <w:ind w:left="360"/>
-        <w:jc w:val="both"/>
-        <w:rPr>
-          <w:rFonts w:ascii="Times New Roman" w:hAnsi="Times New Roman" w:cs="Times New Roman"/>
-          <w:sz w:val="24"/>
-          <w:szCs w:val="24"/>
-        </w:rPr>
-      </w:pPr>
-      <w:r>
-        <w:rPr>
-          <w:rFonts w:ascii="Times New Roman" w:eastAsia="Times New Roman" w:hAnsi="Times New Roman" w:cs="Times New Roman"/>
-          <w:sz w:val="24"/>
-          <w:szCs w:val="24"/>
-        </w:rPr>
-        <w:t>• Absolute Trajectory Error (ATE)</w:t>
-      </w:r>
-    </w:p>
-    <w:p>
-      <w:pPr>
-        <w:spacing w:after="80" w:line="240" w:lineRule="auto"/>
-        <w:ind w:left="360"/>
-        <w:jc w:val="both"/>
-        <w:rPr>
-          <w:rFonts w:ascii="Times New Roman" w:hAnsi="Times New Roman" w:cs="Times New Roman"/>
-          <w:sz w:val="24"/>
-          <w:szCs w:val="24"/>
-        </w:rPr>
-      </w:pPr>
-      <w:r>
-        <w:rPr>
-          <w:rFonts w:ascii="Times New Roman" w:eastAsia="Times New Roman" w:hAnsi="Times New Roman" w:cs="Times New Roman"/>
-          <w:sz w:val="24"/>
-          <w:szCs w:val="24"/>
-        </w:rPr>
-        <w:t>• Relative Pose Error (RPE)</w:t>
-      </w:r>
-    </w:p>
-    <w:p>
-      <w:pPr>
-        <w:spacing w:after="80" w:line="240" w:lineRule="auto"/>
-        <w:ind w:left="360"/>
-        <w:jc w:val="both"/>
-        <w:rPr>
-          <w:rFonts w:ascii="Times New Roman" w:hAnsi="Times New Roman" w:cs="Times New Roman"/>
-          <w:sz w:val="24"/>
-          <w:szCs w:val="24"/>
-        </w:rPr>
-      </w:pPr>
-      <w:r>
-        <w:rPr>
-          <w:rFonts w:ascii="Times New Roman" w:eastAsia="Times New Roman" w:hAnsi="Times New Roman" w:cs="Times New Roman"/>
-          <w:sz w:val="24"/>
-          <w:szCs w:val="24"/>
-        </w:rPr>
-        <w:t>• Scale error</w:t>
-      </w:r>
-    </w:p>
-    <w:p>
-      <w:pPr>
-        <w:spacing w:after="80" w:line="240" w:lineRule="auto"/>
-        <w:ind w:left="360"/>
-        <w:jc w:val="both"/>
-        <w:rPr>
-          <w:rFonts w:ascii="Times New Roman" w:hAnsi="Times New Roman" w:cs="Times New Roman"/>
-          <w:sz w:val="24"/>
-          <w:szCs w:val="24"/>
-        </w:rPr>
-      </w:pPr>
-      <w:r>
-        <w:rPr>
-          <w:rFonts w:ascii="Times New Roman" w:eastAsia="Times New Roman" w:hAnsi="Times New Roman" w:cs="Times New Roman"/>
-          <w:sz w:val="24"/>
-          <w:szCs w:val="24"/>
-        </w:rPr>
-        <w:t>• Localization recovery time</w:t>
-      </w:r>
-    </w:p>
-    <w:p>
-      <w:pPr>
-        <w:spacing w:after="80" w:line="240" w:lineRule="auto"/>
-        <w:ind w:left="360"/>
-        <w:jc w:val="both"/>
-        <w:rPr>
-          <w:rFonts w:ascii="Times New Roman" w:hAnsi="Times New Roman" w:cs="Times New Roman"/>
-          <w:sz w:val="24"/>
-          <w:szCs w:val="24"/>
-        </w:rPr>
-      </w:pPr>
-      <w:r>
-        <w:rPr>
-          <w:rFonts w:ascii="Times New Roman" w:eastAsia="Times New Roman" w:hAnsi="Times New Roman" w:cs="Times New Roman"/>
-          <w:sz w:val="24"/>
-          <w:szCs w:val="24"/>
-        </w:rPr>
-        <w:t>• Robustness to false loop closures</w:t>
-      </w:r>
-    </w:p>
-    <w:p>
-      <w:pPr>
-        <w:spacing w:after="120" w:line="240" w:lineRule="auto"/>
-        <w:jc w:val="both"/>
-        <w:rPr>
-          <w:rFonts w:ascii="Times New Roman" w:hAnsi="Times New Roman" w:cs="Times New Roman"/>
-          <w:sz w:val="24"/>
-          <w:szCs w:val="24"/>
-        </w:rPr>
-      </w:pPr>
-      <w:r>
-        <w:rPr>
-          <w:rFonts w:ascii="Times New Roman" w:eastAsia="Times New Roman" w:hAnsi="Times New Roman" w:cs="Times New Roman"/>
-          <w:sz w:val="24"/>
-          <w:szCs w:val="24"/>
-        </w:rPr>
-        <w:t>Semantic map:</w:t>
-      </w:r>
-    </w:p>
-    <w:p>
-      <w:pPr>
-        <w:spacing w:after="80" w:line="240" w:lineRule="auto"/>
-        <w:ind w:left="360"/>
-        <w:jc w:val="both"/>
-        <w:rPr>
-          <w:rFonts w:ascii="Times New Roman" w:hAnsi="Times New Roman" w:cs="Times New Roman"/>
-          <w:sz w:val="24"/>
-          <w:szCs w:val="24"/>
-        </w:rPr>
-      </w:pPr>
-      <w:r>
-        <w:rPr>
-          <w:rFonts w:ascii="Times New Roman" w:eastAsia="Times New Roman" w:hAnsi="Times New Roman" w:cs="Times New Roman"/>
-          <w:sz w:val="24"/>
-          <w:szCs w:val="24"/>
-        </w:rPr>
-        <w:t>• mIoU (mean Intersection over Union)</w:t>
-      </w:r>
-    </w:p>
-    <w:p>
-      <w:pPr>
-        <w:spacing w:after="80" w:line="240" w:lineRule="auto"/>
-        <w:ind w:left="360"/>
-        <w:jc w:val="both"/>
-        <w:rPr>
-          <w:rFonts w:ascii="Times New Roman" w:hAnsi="Times New Roman" w:cs="Times New Roman"/>
-          <w:sz w:val="24"/>
-          <w:szCs w:val="24"/>
-        </w:rPr>
-      </w:pPr>
-      <w:r>
-        <w:rPr>
-          <w:rFonts w:ascii="Times New Roman" w:eastAsia="Times New Roman" w:hAnsi="Times New Roman" w:cs="Times New Roman"/>
-          <w:sz w:val="24"/>
-          <w:szCs w:val="24"/>
-        </w:rPr>
-        <w:t>• Instance recognition accuracy</w:t>
-      </w:r>
-    </w:p>
-    <w:p>
-      <w:pPr>
-        <w:spacing w:after="80" w:line="240" w:lineRule="auto"/>
-        <w:ind w:left="360"/>
-        <w:jc w:val="both"/>
-        <w:rPr>
-          <w:rFonts w:ascii="Times New Roman" w:hAnsi="Times New Roman" w:cs="Times New Roman"/>
-          <w:sz w:val="24"/>
-          <w:szCs w:val="24"/>
-        </w:rPr>
-      </w:pPr>
-      <w:r>
-        <w:rPr>
-          <w:rFonts w:ascii="Times New Roman" w:eastAsia="Times New Roman" w:hAnsi="Times New Roman" w:cs="Times New Roman"/>
-          <w:sz w:val="24"/>
-          <w:szCs w:val="24"/>
-        </w:rPr>
-        <w:t>• Label stability over time</w:t>
-      </w:r>
-    </w:p>
-    <w:p>
-      <w:pPr>
-        <w:spacing w:after="80" w:line="240" w:lineRule="auto"/>
-        <w:ind w:left="360"/>
-        <w:jc w:val="both"/>
-        <w:rPr>
-          <w:rFonts w:ascii="Times New Roman" w:hAnsi="Times New Roman" w:cs="Times New Roman"/>
-          <w:sz w:val="24"/>
-          <w:szCs w:val="24"/>
-        </w:rPr>
-      </w:pPr>
-      <w:r>
-        <w:rPr>
-          <w:rFonts w:ascii="Times New Roman" w:eastAsia="Times New Roman" w:hAnsi="Times New Roman" w:cs="Times New Roman"/>
-          <w:sz w:val="24"/>
-          <w:szCs w:val="24"/>
-        </w:rPr>
-        <w:t>• Embedding quality</w:t>
-      </w:r>
-    </w:p>
-    <w:p>
-      <w:pPr>
-        <w:spacing w:after="80" w:line="240" w:lineRule="auto"/>
-        <w:ind w:left="360"/>
-        <w:jc w:val="both"/>
-        <w:rPr>
-          <w:rFonts w:ascii="Times New Roman" w:hAnsi="Times New Roman" w:cs="Times New Roman"/>
-          <w:sz w:val="24"/>
-          <w:szCs w:val="24"/>
-        </w:rPr>
-      </w:pPr>
-      <w:r>
-        <w:rPr>
-          <w:rFonts w:ascii="Times New Roman" w:eastAsia="Times New Roman" w:hAnsi="Times New Roman" w:cs="Times New Roman"/>
-          <w:sz w:val="24"/>
-          <w:szCs w:val="24"/>
-        </w:rPr>
-        <w:t>• Spatial relation accuracy</w:t>
-      </w:r>
-    </w:p>
-    <w:p>
-      <w:pPr>
-        <w:spacing w:after="120" w:line="240" w:lineRule="auto"/>
-        <w:jc w:val="both"/>
-        <w:rPr>
-          <w:rFonts w:ascii="Times New Roman" w:hAnsi="Times New Roman" w:cs="Times New Roman"/>
-          <w:sz w:val="24"/>
-          <w:szCs w:val="24"/>
-        </w:rPr>
-      </w:pPr>
-      <w:r>
-        <w:rPr>
-          <w:rFonts w:ascii="Times New Roman" w:eastAsia="Times New Roman" w:hAnsi="Times New Roman" w:cs="Times New Roman"/>
-          <w:sz w:val="24"/>
-          <w:szCs w:val="24"/>
-        </w:rPr>
-        <w:t>Prediction:</w:t>
-      </w:r>
-    </w:p>
-    <w:p>
-      <w:pPr>
-        <w:spacing w:after="80" w:line="240" w:lineRule="auto"/>
-        <w:ind w:left="360"/>
-        <w:jc w:val="both"/>
-        <w:rPr>
-          <w:rFonts w:ascii="Times New Roman" w:hAnsi="Times New Roman" w:cs="Times New Roman"/>
-          <w:sz w:val="24"/>
-          <w:szCs w:val="24"/>
-        </w:rPr>
-      </w:pPr>
-      <w:r>
-        <w:rPr>
-          <w:rFonts w:ascii="Times New Roman" w:eastAsia="Times New Roman" w:hAnsi="Times New Roman" w:cs="Times New Roman"/>
-          <w:sz w:val="24"/>
-          <w:szCs w:val="24"/>
-        </w:rPr>
-        <w:t>• Future occupancy IoU</w:t>
-      </w:r>
-    </w:p>
-    <w:p>
-      <w:pPr>
-        <w:spacing w:after="80" w:line="240" w:lineRule="auto"/>
-        <w:ind w:left="360"/>
-        <w:jc w:val="both"/>
-        <w:rPr>
-          <w:rFonts w:ascii="Times New Roman" w:hAnsi="Times New Roman" w:cs="Times New Roman"/>
-          <w:sz w:val="24"/>
-          <w:szCs w:val="24"/>
-        </w:rPr>
-      </w:pPr>
-      <w:r>
-        <w:rPr>
-          <w:rFonts w:ascii="Times New Roman" w:eastAsia="Times New Roman" w:hAnsi="Times New Roman" w:cs="Times New Roman"/>
-          <w:sz w:val="24"/>
-          <w:szCs w:val="24"/>
-        </w:rPr>
-        <w:t>• 3D flow error</w:t>
-      </w:r>
-    </w:p>
-    <w:p>
-      <w:pPr>
-        <w:spacing w:after="80" w:line="240" w:lineRule="auto"/>
-        <w:ind w:left="360"/>
-        <w:jc w:val="both"/>
-        <w:rPr>
-          <w:rFonts w:ascii="Times New Roman" w:hAnsi="Times New Roman" w:cs="Times New Roman"/>
-          <w:sz w:val="24"/>
-          <w:szCs w:val="24"/>
-        </w:rPr>
-      </w:pPr>
-      <w:r>
-        <w:rPr>
-          <w:rFonts w:ascii="Times New Roman" w:eastAsia="Times New Roman" w:hAnsi="Times New Roman" w:cs="Times New Roman"/>
-          <w:sz w:val="24"/>
-          <w:szCs w:val="24"/>
-        </w:rPr>
-        <w:lastRenderedPageBreak/>
-        <w:t>• Brier score</w:t>
-      </w:r>
-    </w:p>
-    <w:p>
-      <w:pPr>
-        <w:spacing w:after="80" w:line="240" w:lineRule="auto"/>
-        <w:ind w:left="360"/>
-        <w:jc w:val="both"/>
-        <w:rPr>
-          <w:rFonts w:ascii="Times New Roman" w:hAnsi="Times New Roman" w:cs="Times New Roman"/>
-          <w:sz w:val="24"/>
-          <w:szCs w:val="24"/>
-        </w:rPr>
-      </w:pPr>
-      <w:r>
-        <w:rPr>
-          <w:rFonts w:ascii="Times New Roman" w:eastAsia="Times New Roman" w:hAnsi="Times New Roman" w:cs="Times New Roman"/>
-          <w:sz w:val="24"/>
-          <w:szCs w:val="24"/>
-        </w:rPr>
-        <w:t>• Expected Calibration Error (ECE)</w:t>
-      </w:r>
-    </w:p>
-    <w:p>
-      <w:pPr>
-        <w:spacing w:after="80" w:line="240" w:lineRule="auto"/>
-        <w:ind w:left="360"/>
-        <w:jc w:val="both"/>
-        <w:rPr>
-          <w:rFonts w:ascii="Times New Roman" w:hAnsi="Times New Roman" w:cs="Times New Roman"/>
-          <w:sz w:val="24"/>
-          <w:szCs w:val="24"/>
-        </w:rPr>
-      </w:pPr>
-      <w:r>
-        <w:rPr>
-          <w:rFonts w:ascii="Times New Roman" w:eastAsia="Times New Roman" w:hAnsi="Times New Roman" w:cs="Times New Roman"/>
-          <w:sz w:val="24"/>
-          <w:szCs w:val="24"/>
-        </w:rPr>
-        <w:t>• Recall for elevated-risk areas</w:t>
-      </w:r>
-    </w:p>
-    <w:p>
-      <w:pPr>
-        <w:spacing w:after="120" w:line="240" w:lineRule="auto"/>
-        <w:jc w:val="both"/>
-        <w:rPr>
-          <w:rFonts w:ascii="Times New Roman" w:hAnsi="Times New Roman" w:cs="Times New Roman"/>
-          <w:sz w:val="24"/>
-          <w:szCs w:val="24"/>
-        </w:rPr>
-      </w:pPr>
-      <w:r>
-        <w:rPr>
-          <w:rFonts w:ascii="Times New Roman" w:eastAsia="Times New Roman" w:hAnsi="Times New Roman" w:cs="Times New Roman"/>
-          <w:sz w:val="24"/>
-          <w:szCs w:val="24"/>
-        </w:rPr>
-        <w:t>Navigation:</w:t>
-      </w:r>
-    </w:p>
-    <w:p>
-      <w:pPr>
-        <w:spacing w:after="80" w:line="240" w:lineRule="auto"/>
-        <w:ind w:left="360"/>
-        <w:jc w:val="both"/>
-        <w:rPr>
-          <w:rFonts w:ascii="Times New Roman" w:hAnsi="Times New Roman" w:cs="Times New Roman"/>
-          <w:sz w:val="24"/>
-          <w:szCs w:val="24"/>
-        </w:rPr>
-      </w:pPr>
-      <w:r>
-        <w:rPr>
-          <w:rFonts w:ascii="Times New Roman" w:eastAsia="Times New Roman" w:hAnsi="Times New Roman" w:cs="Times New Roman"/>
-          <w:sz w:val="24"/>
-          <w:szCs w:val="24"/>
-        </w:rPr>
-        <w:t>• Mission completion rate</w:t>
-      </w:r>
-    </w:p>
-    <w:p>
-      <w:pPr>
-        <w:spacing w:after="80" w:line="240" w:lineRule="auto"/>
-        <w:ind w:left="360"/>
-        <w:jc w:val="both"/>
-        <w:rPr>
-          <w:rFonts w:ascii="Times New Roman" w:hAnsi="Times New Roman" w:cs="Times New Roman"/>
-          <w:sz w:val="24"/>
-          <w:szCs w:val="24"/>
-        </w:rPr>
-      </w:pPr>
-      <w:r>
-        <w:rPr>
-          <w:rFonts w:ascii="Times New Roman" w:eastAsia="Times New Roman" w:hAnsi="Times New Roman" w:cs="Times New Roman"/>
-          <w:sz w:val="24"/>
-          <w:szCs w:val="24"/>
-        </w:rPr>
-        <w:t>• Number of collisions</w:t>
-      </w:r>
-    </w:p>
-    <w:p>
-      <w:pPr>
-        <w:spacing w:after="80" w:line="240" w:lineRule="auto"/>
-        <w:ind w:left="360"/>
-        <w:jc w:val="both"/>
-        <w:rPr>
-          <w:rFonts w:ascii="Times New Roman" w:hAnsi="Times New Roman" w:cs="Times New Roman"/>
-          <w:sz w:val="24"/>
-          <w:szCs w:val="24"/>
-        </w:rPr>
-      </w:pPr>
-      <w:r>
-        <w:rPr>
-          <w:rFonts w:ascii="Times New Roman" w:eastAsia="Times New Roman" w:hAnsi="Times New Roman" w:cs="Times New Roman"/>
-          <w:sz w:val="24"/>
-          <w:szCs w:val="24"/>
-        </w:rPr>
-        <w:t>• Minimum obstacle clearance</w:t>
-      </w:r>
-    </w:p>
-    <w:p>
-      <w:pPr>
-        <w:spacing w:after="80" w:line="240" w:lineRule="auto"/>
-        <w:ind w:left="360"/>
-        <w:jc w:val="both"/>
-        <w:rPr>
-          <w:rFonts w:ascii="Times New Roman" w:hAnsi="Times New Roman" w:cs="Times New Roman"/>
-          <w:sz w:val="24"/>
-          <w:szCs w:val="24"/>
-        </w:rPr>
-      </w:pPr>
-      <w:r>
-        <w:rPr>
-          <w:rFonts w:ascii="Times New Roman" w:eastAsia="Times New Roman" w:hAnsi="Times New Roman" w:cs="Times New Roman"/>
-          <w:sz w:val="24"/>
-          <w:szCs w:val="24"/>
-        </w:rPr>
-        <w:t>• Trajectory length and time</w:t>
-      </w:r>
-    </w:p>
-    <w:p>
-      <w:pPr>
-        <w:spacing w:after="80" w:line="240" w:lineRule="auto"/>
-        <w:ind w:left="360"/>
-        <w:jc w:val="both"/>
-        <w:rPr>
-          <w:rFonts w:ascii="Times New Roman" w:hAnsi="Times New Roman" w:cs="Times New Roman"/>
-          <w:sz w:val="24"/>
-          <w:szCs w:val="24"/>
-        </w:rPr>
-      </w:pPr>
-      <w:r>
-        <w:rPr>
-          <w:rFonts w:ascii="Times New Roman" w:eastAsia="Times New Roman" w:hAnsi="Times New Roman" w:cs="Times New Roman"/>
-          <w:sz w:val="24"/>
-          <w:szCs w:val="24"/>
-        </w:rPr>
-        <w:t>• Energy cost</w:t>
-      </w:r>
-    </w:p>
-    <w:p>
-      <w:pPr>
-        <w:spacing w:after="80" w:line="240" w:lineRule="auto"/>
-        <w:ind w:left="360"/>
-        <w:jc w:val="both"/>
-        <w:rPr>
-          <w:rFonts w:ascii="Times New Roman" w:hAnsi="Times New Roman" w:cs="Times New Roman"/>
-          <w:sz w:val="24"/>
-          <w:szCs w:val="24"/>
-        </w:rPr>
-      </w:pPr>
-      <w:r>
-        <w:rPr>
-          <w:rFonts w:ascii="Times New Roman" w:eastAsia="Times New Roman" w:hAnsi="Times New Roman" w:cs="Times New Roman"/>
-          <w:sz w:val="24"/>
-          <w:szCs w:val="24"/>
-        </w:rPr>
-        <w:t>• Number of emergency replanning events</w:t>
-      </w:r>
-    </w:p>
-    <w:p>
-      <w:pPr>
-        <w:spacing w:after="120" w:line="240" w:lineRule="auto"/>
-        <w:jc w:val="both"/>
-        <w:rPr>
-          <w:rFonts w:ascii="Times New Roman" w:hAnsi="Times New Roman" w:cs="Times New Roman"/>
-          <w:sz w:val="24"/>
-          <w:szCs w:val="24"/>
-        </w:rPr>
-      </w:pPr>
-      <w:r>
-        <w:rPr>
-          <w:rFonts w:ascii="Times New Roman" w:eastAsia="Times New Roman" w:hAnsi="Times New Roman" w:cs="Times New Roman"/>
-          <w:sz w:val="24"/>
-          <w:szCs w:val="24"/>
-        </w:rPr>
-        <w:t>Computational efficiency:</w:t>
-      </w:r>
-    </w:p>
-    <w:p>
-      <w:pPr>
-        <w:spacing w:after="80" w:line="240" w:lineRule="auto"/>
-        <w:ind w:left="360"/>
-        <w:jc w:val="both"/>
-        <w:rPr>
-          <w:rFonts w:ascii="Times New Roman" w:hAnsi="Times New Roman" w:cs="Times New Roman"/>
-          <w:sz w:val="24"/>
-          <w:szCs w:val="24"/>
-        </w:rPr>
-      </w:pPr>
-      <w:r>
-        <w:rPr>
-          <w:rFonts w:ascii="Times New Roman" w:eastAsia="Times New Roman" w:hAnsi="Times New Roman" w:cs="Times New Roman"/>
-          <w:sz w:val="24"/>
-          <w:szCs w:val="24"/>
-        </w:rPr>
-        <w:t>• Latency</w:t>
-      </w:r>
-    </w:p>
-    <w:p>
-      <w:pPr>
-        <w:spacing w:after="80" w:line="240" w:lineRule="auto"/>
-        <w:ind w:left="360"/>
-        <w:jc w:val="both"/>
-        <w:rPr>
-          <w:rFonts w:ascii="Times New Roman" w:hAnsi="Times New Roman" w:cs="Times New Roman"/>
-          <w:sz w:val="24"/>
-          <w:szCs w:val="24"/>
-        </w:rPr>
-      </w:pPr>
-      <w:r>
-        <w:rPr>
-          <w:rFonts w:ascii="Times New Roman" w:eastAsia="Times New Roman" w:hAnsi="Times New Roman" w:cs="Times New Roman"/>
-          <w:sz w:val="24"/>
-          <w:szCs w:val="24"/>
-        </w:rPr>
-        <w:t>• Frames per second (FPS)</w:t>
-      </w:r>
-    </w:p>
-    <w:p>
-      <w:pPr>
-        <w:spacing w:after="80" w:line="240" w:lineRule="auto"/>
-        <w:ind w:left="360"/>
-        <w:jc w:val="both"/>
-        <w:rPr>
-          <w:rFonts w:ascii="Times New Roman" w:hAnsi="Times New Roman" w:cs="Times New Roman"/>
-          <w:sz w:val="24"/>
-          <w:szCs w:val="24"/>
-        </w:rPr>
-      </w:pPr>
-      <w:r>
-        <w:rPr>
-          <w:rFonts w:ascii="Times New Roman" w:eastAsia="Times New Roman" w:hAnsi="Times New Roman" w:cs="Times New Roman"/>
-          <w:sz w:val="24"/>
-          <w:szCs w:val="24"/>
-        </w:rPr>
-        <w:t>• Memory usage</w:t>
-      </w:r>
-    </w:p>
-    <w:p>
-      <w:pPr>
-        <w:spacing w:after="80" w:line="240" w:lineRule="auto"/>
-        <w:ind w:left="360"/>
-        <w:jc w:val="both"/>
-        <w:rPr>
-          <w:rFonts w:ascii="Times New Roman" w:hAnsi="Times New Roman" w:cs="Times New Roman"/>
-          <w:sz w:val="24"/>
-          <w:szCs w:val="24"/>
-        </w:rPr>
-      </w:pPr>
-      <w:r>
-        <w:rPr>
-          <w:rFonts w:ascii="Times New Roman" w:eastAsia="Times New Roman" w:hAnsi="Times New Roman" w:cs="Times New Roman"/>
-          <w:sz w:val="24"/>
-          <w:szCs w:val="24"/>
-        </w:rPr>
-        <w:t>• Energy consumption</w:t>
-      </w:r>
-    </w:p>
-    <w:p>
-      <w:pPr>
-        <w:spacing w:after="80" w:line="240" w:lineRule="auto"/>
-        <w:ind w:left="360"/>
-        <w:jc w:val="both"/>
-        <w:rPr>
-          <w:rFonts w:ascii="Times New Roman" w:hAnsi="Times New Roman" w:cs="Times New Roman"/>
-          <w:sz w:val="24"/>
-          <w:szCs w:val="24"/>
-        </w:rPr>
-      </w:pPr>
-      <w:r>
-        <w:rPr>
-          <w:rFonts w:ascii="Times New Roman" w:eastAsia="Times New Roman" w:hAnsi="Times New Roman" w:cs="Times New Roman"/>
-          <w:sz w:val="24"/>
-          <w:szCs w:val="24"/>
-        </w:rPr>
-        <w:t>• Number of processed tokens</w:t>
-      </w:r>
-    </w:p>
-    <w:p>
-      <w:pPr>
-        <w:spacing w:after="80" w:line="240" w:lineRule="auto"/>
-        <w:ind w:left="360"/>
-        <w:jc w:val="both"/>
-        <w:rPr>
-          <w:rFonts w:ascii="Times New Roman" w:hAnsi="Times New Roman" w:cs="Times New Roman"/>
-          <w:sz w:val="24"/>
-          <w:szCs w:val="24"/>
-        </w:rPr>
-      </w:pPr>
-      <w:r>
-        <w:rPr>
-          <w:rFonts w:ascii="Times New Roman" w:eastAsia="Times New Roman" w:hAnsi="Times New Roman" w:cs="Times New Roman"/>
-          <w:sz w:val="24"/>
-          <w:szCs w:val="24"/>
-        </w:rPr>
-        <w:t>• Persistent map size</w:t>
+          <w:sz w:val="24"/>
+        </w:rPr>
+        <w:t>7.4. Confirmatory Protocol and Statistical Analysis</w:t>
+      </w:r>
+    </w:p>
+    <w:p>
+      <w:pPr/>
+      <w:r>
+        <w:t>The preregistered H1-H7 study uses sequence or mission level inference rather than treating individual frames as independent samples. Continuous outcomes are summarized with paired mean differences and 95% BCa bootstrap confidence intervals using 10,000 resamples. Mission success is modeled as a paired scenario-level probability outcome, while distance-normalized event counts use Poisson or negative-binomial modeling with log distance as an offset according to the preregistered overdispersion rule.</w:t>
+      </w:r>
+    </w:p>
+    <w:p>
+      <w:pPr/>
+      <w:r>
+        <w:t>The seven H1-H7 confirmatory decisions form one family and are corrected with the sequential Holm procedure at family-wise alpha = 0.05. H1-H6 require the corrected result and confidence interval to support the predicted superiority direction. H7 additionally requires mission-success non-inferiority within 2 percentage points while improving p95 latency.</w:t>
+      </w:r>
+    </w:p>
+    <w:p>
+      <w:pPr/>
+      <w:r>
+        <w:t>No missing technical result is imputed. Aborts and algorithm failures remain in the denominator for safety outcomes; complete-case reporting is accompanied by the preregistered worst-case sensitivity analysis. Exclusions are limited to integrity failures, excessive missing timestamps, independently confirmed sensor faults, or operational constraints defined before result inspection.</w:t>
+      </w:r>
+    </w:p>
+    <w:p>
+      <w:pPr/>
+      <w:r>
+        <w:t>The external system comparison is reported separately from this H1-H7 inferential family. It uses the same frozen datasets and common evaluators, but its effect estimates describe differences between complete systems rather than component-level causal effects.</w:t>
       </w:r>
     </w:p>
     <w:p>
@@ -12510,12 +11466,7 @@
         </w:rPr>
       </w:pPr>
       <w:r>
-        <w:rPr>
-          <w:rFonts w:ascii="Times New Roman" w:eastAsia="Times New Roman" w:hAnsi="Times New Roman" w:cs="Times New Roman"/>
-          <w:sz w:val="24"/>
-          <w:szCs w:val="24"/>
-        </w:rPr>
-        <w:t>Future work should focus on implementing a system prototype, experimental validation of research hypotheses, computational efficiency optimization, and extension with additional sensor modalities (e.g., radar, ultrasound) and operational scenarios (e.g., multi-robot coordination, long-term missions).</w:t>
+        <w:t>Future work should focus on completing and training the learned S4D-TAM model, validating public-dataset converters and pinned external baselines, executing the preregistered H1-H7 mechanism study, and progressing from offline evaluation through SIL, HIL, and controlled real-flight validation. Additional engineering work includes the probabilistic DBN/particle backend, MPPI planning, adaptive octree/LOD storage, active perception, and safety-aware real-time scheduling.</w:t>
       </w:r>
     </w:p>
     <w:p>
@@ -12726,12 +11677,7 @@
         </w:rPr>
       </w:pPr>
       <w:r>
-        <w:rPr>
-          <w:rFonts w:ascii="Times New Roman" w:eastAsia="Times New Roman" w:hAnsi="Times New Roman" w:cs="Times New Roman"/>
-          <w:sz w:val="24"/>
-          <w:szCs w:val="24"/>
-        </w:rPr>
-        <w:t>Seven research hypotheses have been formulated regarding computational efficiency, localization accuracy, prediction quality, robustness to uncertainty, reference map integration, topological descriptor utility, and navigation safety. An experimental validation methodology has been proposed comprising datasets, system variants, and evaluation metrics.</w:t>
+        <w:t>Seven preregistered mechanism hypotheses have been formulated for semantics, temporal state, calibrated uncertainty, topology, reference-map support, predictive risk, and token lifecycle. Their causal full-vs-H1-H7 study is explicitly separated from the external system comparison against ORB-SLAM3, VINS-Mono, FAST-LIO2, and LIO-SAM.</w:t>
       </w:r>
     </w:p>
     <w:p>
@@ -12765,12 +11711,7 @@
         </w:rPr>
       </w:pPr>
       <w:r>
-        <w:rPr>
-          <w:rFonts w:ascii="Times New Roman" w:eastAsia="Times New Roman" w:hAnsi="Times New Roman" w:cs="Times New Roman"/>
-          <w:sz w:val="24"/>
-          <w:szCs w:val="24"/>
-        </w:rPr>
-        <w:t>1. Prototype implementation of the S4D-TAM system and experimental validation on the TartanAir, Blackbird, MARSIM, and dedicated UAV datasets.</w:t>
+        <w:t>1. Completion and training of the learned S4D-TAM model followed by two-level validation: external system comparison on TartanAir, Blackbird, MARSIM, and AeroVerse, and the preregistered internal full-vs-H1-H7 mechanism study.</w:t>
       </w:r>
     </w:p>
     <w:p>

</xml_diff>

<commit_message>
research: separate external benchmarks from H1-H7 mechanism study
Synchronize the S4D-TAM manuscript, benchmark contracts and documentation around separate external system comparison and internal H1-H7 mechanism analysis. Publish the final manuscript as DOCX and equation-preserving PDF.
</commit_message>
<xml_diff>
--- a/paper/S4D_TAM_draft_0830.docx
+++ b/paper/S4D_TAM_draft_0830.docx
@@ -188,30 +188,7 @@
         </w:rPr>
       </w:pPr>
       <w:r>
-        <w:rPr>
-          <w:rFonts w:ascii="Times New Roman" w:eastAsia="Times New Roman" w:hAnsi="Times New Roman" w:cs="Times New Roman"/>
-          <w:sz w:val="24"/>
-          <w:szCs w:val="24"/>
-        </w:rPr>
-        <w:t>We propose S4D-TAM (Semantic 4D Token Attention Map), a novel navigation system architecture for unmanned aerial vehicles (UAVs) operating in GNSS-degraded environments. Unlike classical methods that repeatedly analyze raw image streams, the proposed system transforms sensor data (RGB, thermal, IMU, GNSS) into a persistent map of semantic 4D tokens. Each token represents a spatial fragment or object instance and contains its geometry, semantic embedding, dynamics, observation history, and calibrated uncertainty. A hierarchical spatiotemporal transformer updates the world model, aligns it with reference maps, and forecasts occupancy in partially observable regions. The p</w:t>
-      </w:r>
-      <w:r>
-        <w:rPr>
-          <w:rFonts w:ascii="Times New Roman" w:eastAsia="Times New Roman" w:hAnsi="Times New Roman" w:cs="Times New Roman"/>
-          <w:sz w:val="24"/>
-          <w:szCs w:val="24"/>
-        </w:rPr>
-        <w:t>redictive map is then used by a </w:t>
-      </w:r>
-      <w:bookmarkStart w:id="0" w:name="_GoBack"/>
-      <w:bookmarkEnd w:id="0"/>
-      <w:r>
-        <w:rPr>
-          <w:rFonts w:ascii="Times New Roman" w:eastAsia="Times New Roman" w:hAnsi="Times New Roman" w:cs="Times New Roman"/>
-          <w:sz w:val="24"/>
-          <w:szCs w:val="24"/>
-        </w:rPr>
-        <w:t>planner that accounts for risk, energy cost, and information value of future observations. The proposed representation aims to reduce image processing redundancy, increase robustness to GNSS degradation, and enable decision-making based on persistent spatial memory rather than solely on the current sensor field of view. The article presents the system concept, literature review, mathematical description of the architecture, and a proposal for experimental validation methodology.</w:t>
+        <w:t>We propose S4D-TAM (Semantic 4D Token Attention Map), a novel navigation system architecture for unmanned aerial vehicles (UAVs) operating in GNSS-degraded environments. Unlike classical methods that repeatedly analyze raw image streams, the proposed system transforms sensor data (RGB, thermal, IMU, GNSS) into a persistent map of semantic 4D tokens. Each token represents a spatial fragment or object instance and contains its geometry, semantic embedding, dynamics, observation history, and calibrated uncertainty. A hierarchical spatiotemporal transformer updates the world model, aligns it with reference maps, and forecasts occupancy in partially observable regions. The predictive map is then used by a planner that accounts for risk, energy cost, and information value of future observations. The proposed representation aims to reduce image processing redundancy, increase robustness to GNSS degradation, and enable decision-making based on persistent spatial memory rather than solely on the current sensor field of view. The article presents the system concept, literature review, mathematical description, an executable auditable reference implementation, and a two-level experimental methodology separating external system comparison from internal mechanism ablation. Confirmatory experimental results are not yet reported.</w:t>
       </w:r>
     </w:p>
     <w:p>
@@ -427,6 +404,17 @@
     </w:p>
     <w:p>
       <w:pPr>
+        <w:ind w:left="360"/>
+      </w:pPr>
+      <w:r>
+        <w:rPr>
+          <w:rFonts w:ascii="Times New Roman" w:hAnsi="Times New Roman"/>
+        </w:rPr>
+        <w:t>4.3. Current Reference Implementation and Target Research Modules</w:t>
+      </w:r>
+    </w:p>
+    <w:p>
+      <w:pPr>
         <w:spacing w:after="40" w:line="240" w:lineRule="auto"/>
         <w:rPr>
           <w:rFonts w:ascii="Times New Roman" w:hAnsi="Times New Roman" w:cs="Times New Roman"/>
@@ -717,10 +705,29 @@
         </w:rPr>
       </w:pPr>
       <w:r>
-        <w:rPr>
-          <w:rFonts w:ascii="Times New Roman" w:eastAsia="Times New Roman" w:hAnsi="Times New Roman" w:cs="Times New Roman"/>
-        </w:rPr>
-        <w:t>7.2. System Variants</w:t>
+        <w:t>7.2. Two-Level Comparison Design</w:t>
+      </w:r>
+    </w:p>
+    <w:p>
+      <w:pPr>
+        <w:ind w:left="720"/>
+      </w:pPr>
+      <w:r>
+        <w:rPr>
+          <w:rFonts w:ascii="Times New Roman" w:hAnsi="Times New Roman"/>
+        </w:rPr>
+        <w:t>7.2.1. External System Comparison</w:t>
+      </w:r>
+    </w:p>
+    <w:p>
+      <w:pPr>
+        <w:ind w:left="720"/>
+      </w:pPr>
+      <w:r>
+        <w:rPr>
+          <w:rFonts w:ascii="Times New Roman" w:hAnsi="Times New Roman"/>
+        </w:rPr>
+        <w:t>7.2.2. Internal Mechanism Study</w:t>
       </w:r>
     </w:p>
     <w:p>
@@ -736,6 +743,17 @@
           <w:rFonts w:ascii="Times New Roman" w:eastAsia="Times New Roman" w:hAnsi="Times New Roman" w:cs="Times New Roman"/>
         </w:rPr>
         <w:t>7.3. Metrics</w:t>
+      </w:r>
+    </w:p>
+    <w:p>
+      <w:pPr>
+        <w:ind w:left="360"/>
+      </w:pPr>
+      <w:r>
+        <w:rPr>
+          <w:rFonts w:ascii="Times New Roman" w:hAnsi="Times New Roman"/>
+        </w:rPr>
+        <w:t>7.4. Confirmatory Protocol and Statistical Analysis</w:t>
       </w:r>
     </w:p>
     <w:p>
@@ -907,13 +925,7 @@
         </w:rPr>
       </w:pPr>
       <w:r>
-        <w:rPr>
-          <w:rFonts w:ascii="Times New Roman" w:eastAsia="Times New Roman" w:hAnsi="Times New Roman" w:cs="Times New Roman"/>
-          <w:sz w:val="24"/>
-          <w:szCs w:val="24"/>
-        </w:rPr>
-        <w:lastRenderedPageBreak/>
-        <w:t>The article is conceptual and theoretical in character, presenting a new system architecture together with a literature review and mathematical description, without experimental results. The paper is organized as follows. Section 2 reviews the literature on semantic SLAM for UAVs, point cloud transformers, 4D occupancy forecasting, world models and planning, and navigation in GNSS-denied environments. Section 3 identifies the research gap and motivation. Section 4 presents the S4D-TAM system concept and the definition of the 4D token. Section 5 provides a detailed mathematical description of the architecture. Section 6 formulates research hypotheses. Section 7 proposes an experimental validation methodology. Sections 8 and 9 contain the discussion and conclusions.</w:t>
+        <w:t>The article combines a conceptual system architecture with an executable research reference and a reproducible benchmark framework. The current repository implements token state and lifecycle management, proposal and association, multimodal encoder interfaces, attention-related processing, uncertainty calibration utilities, reference-map and topological support, causal occupancy and motion forecasting, deterministic risk-aware planning, telemetry, and the integrated S4DTAMReference execution path. The final learned hierarchical model, full public-dataset reproduction, and confirmatory results remain under development. Section 7 therefore specifies a prospective two-level validation protocol rather than reporting final performance results.</w:t>
       </w:r>
     </w:p>
     <w:p>
@@ -2412,6 +2424,41 @@
           <w:szCs w:val="24"/>
         </w:rPr>
         <w:t>Layer 9: Active Perception The active perception module selects camera orientation, processing frequency, and sensory modality based on expected uncertainty reduction relative to cost. The IR camera may be activated more frequently in low illumination or in areas where prior data indicates the possible presence of a thermal object. The RGB camera need not be analyzed by the full network at every frame [1], [3], [6].</w:t>
+      </w:r>
+    </w:p>
+    <w:p>
+      <w:pPr/>
+      <w:r>
+        <w:rPr>
+          <w:rFonts w:ascii="Times New Roman" w:hAnsi="Times New Roman"/>
+          <w:b/>
+          <w:sz w:val="24"/>
+        </w:rPr>
+        <w:t>4.3. Current Reference Implementation and Target Research Modules</w:t>
+      </w:r>
+    </w:p>
+    <w:p>
+      <w:pPr/>
+      <w:r>
+        <w:t>The S4D-TAM concept is accompanied by an executable Python research reference. The implementation is intentionally modular so that individual mechanisms can be tested, replaced, and ablated without changing the evaluator boundary.</w:t>
+      </w:r>
+    </w:p>
+    <w:p>
+      <w:pPr/>
+      <w:r>
+        <w:t>Implemented reference components include persistent token state and lifecycle management (token.py, memory.py), token proposal and data association (proposal.py, association.py), modality-oriented encoder interfaces and masked fusion (encoders/), attention-related processing (attention.py), calibration and uncertainty utilities (calibration.py), reference-map and topological support (reference_map.py, topology.py), causal probabilistic occupancy and motion forecasting (forecasting.py), deterministic risk-, energy-, time-, progress-, and information-aware planning (planner.py), structured event telemetry (telemetry.py), and the integrated S4DTAMReference pipeline (pipeline.py).</w:t>
+      </w:r>
+    </w:p>
+    <w:p>
+      <w:pPr/>
+      <w:r>
+        <w:t>The reference implementation favors causality, deterministic replay, explicit uncertainty, and auditability over maximum throughput. This is advantageous during early numerical validation because an observed difference can be traced to a defined mechanism rather than hidden implementation nondeterminism.</w:t>
+      </w:r>
+    </w:p>
+    <w:p>
+      <w:pPr/>
+      <w:r>
+        <w:t>Several formulations in Sections 5.12-5.15 describe target research extensions rather than already completed backends. These include a learned hierarchical spatiotemporal model, a DBN/particle or equivalent multimodal probabilistic scene-state backend, an MPPI planner backend, adaptive octree/LOD storage, a closed-loop active-perception controller, and a safety-aware real-time scheduler. They are maintained as explicit implementation milestones and must preserve the same causal and evaluator-facing contracts when introduced.</w:t>
       </w:r>
     </w:p>
     <w:p>
@@ -8133,6 +8180,11 @@
       </w:r>
     </w:p>
     <w:p>
+      <w:r>
+        <w:t>Implementation status. The current executable reference uses a strictly causal probabilistic occupancy and motion forecaster driven only by observations available up to the prediction time. It produces Bernoulli occupancy probabilities, flow means, uncertainty estimates, observability masks, and physically timed forecast horizons, including irregular or dropped samples. This deterministic causal baseline is preferred for initial validation because future-frame leakage is structurally impossible. The DBN and particle approximation below define the target probabilistic extension for multimodal future-state uncertainty and are not claimed as the current default backend.</w:t>
+      </w:r>
+    </w:p>
+    <w:p>
       <w:pPr>
         <w:spacing w:after="120" w:line="240" w:lineRule="auto"/>
         <w:jc w:val="both"/>
@@ -8741,6 +8793,11 @@
       </w:r>
     </w:p>
     <w:p>
+      <w:r>
+        <w:t>Implementation status. The executable reference planner currently uses deterministic finite-horizon beam search over admissible acceleration controls with explicit kinematic limits and decomposed collision-risk, energy, time, goal-progress, and information-value terms. This approach is more auditable than stochastic sampling for early confirmatory experiments because identical inputs generate the same candidate evaluation and decision trace. MPPI remains a planned backend for richer dynamics and will be introduced behind the same planner contract only after direct comparison with the deterministic reference.</w:t>
+      </w:r>
+    </w:p>
+    <w:p>
       <w:pPr>
         <w:spacing w:after="120" w:line="240" w:lineRule="auto"/>
         <w:jc w:val="both"/>
@@ -9254,12 +9311,7 @@
         </w:rPr>
       </w:pPr>
       <w:r>
-        <w:rPr>
-          <w:rFonts w:ascii="Times New Roman" w:eastAsia="Times New Roman" w:hAnsi="Times New Roman" w:cs="Times New Roman"/>
-          <w:sz w:val="24"/>
-          <w:szCs w:val="24"/>
-        </w:rPr>
-        <w:t>where ℱ is the space of feasible trajectories (kinematic and dynamic UAV constraints). Since direct minimization of the expected value is computationally expensive, approximation by particle trajectory sampling via MPPI (Model Predictive Path Integral) is employed:</w:t>
+        <w:t>For a future high-dimensional stochastic planning backend, direct minimization of the expected value may be approximated by particle trajectory sampling via MPPI (Model Predictive Path Integral). The following formulation defines that target extension; it is not required by the current deterministic reference planner:</w:t>
       </w:r>
     </w:p>
     <w:p>
@@ -9400,6 +9452,11 @@
       </w:r>
     </w:p>
     <w:p>
+      <w:r>
+        <w:t>Implementation status. The current token memory already enforces bounded history and configurable limits on token count, map memory, and update time, together with lifecycle activation, sleeping, reactivation, merging, and removal rules. These mechanisms implement the resource-bounded principle of this section. The full adaptive octree and Level-of-Detail storage policy described below remains a planned world-model backend and will be validated separately before becoming the default representation.</w:t>
+      </w:r>
+    </w:p>
+    <w:p>
       <w:pPr>
         <w:spacing w:after="120" w:line="240" w:lineRule="auto"/>
         <w:jc w:val="both"/>
@@ -10059,6 +10116,11 @@
           <w:szCs w:val="24"/>
         </w:rPr>
         <w:t>5.15. Computational Resource Management and Bottleneck Elimination</w:t>
+      </w:r>
+    </w:p>
+    <w:p>
+      <w:r>
+        <w:t>Implementation status. Structured telemetry and resource budgets already expose update-time, token-count, memory, lifecycle, and decision events needed for profiling and replay. Predictive queue-overflow control, EDF-RT scheduling, guaranteed safety-critical CPU reservations, and the full survival-mode controller described below remain planned real-time systems extensions rather than features of the current Python reference.</w:t>
       </w:r>
     </w:p>
     <w:p>
@@ -10710,155 +10772,57 @@
       </w:r>
     </w:p>
     <w:p>
-      <w:pPr>
-        <w:spacing w:after="120" w:line="240" w:lineRule="auto"/>
-        <w:jc w:val="both"/>
-        <w:rPr>
-          <w:rFonts w:ascii="Times New Roman" w:hAnsi="Times New Roman" w:cs="Times New Roman"/>
-          <w:sz w:val="24"/>
-          <w:szCs w:val="24"/>
-        </w:rPr>
-      </w:pPr>
-      <w:r>
-        <w:rPr>
-          <w:rFonts w:ascii="Times New Roman" w:eastAsia="Times New Roman" w:hAnsi="Times New Roman" w:cs="Times New Roman"/>
-          <w:sz w:val="24"/>
-          <w:szCs w:val="24"/>
-        </w:rPr>
-        <w:t>We propose the following research hypotheses for experimental verification:</w:t>
-      </w:r>
-    </w:p>
-    <w:p>
-      <w:pPr>
-        <w:spacing w:after="120" w:line="240" w:lineRule="auto"/>
-        <w:jc w:val="both"/>
-        <w:rPr>
-          <w:rFonts w:ascii="Times New Roman" w:hAnsi="Times New Roman" w:cs="Times New Roman"/>
-          <w:sz w:val="24"/>
-          <w:szCs w:val="24"/>
-        </w:rPr>
-      </w:pPr>
-      <w:r>
-        <w:rPr>
-          <w:rFonts w:ascii="Times New Roman" w:eastAsia="Times New Roman" w:hAnsi="Times New Roman" w:cs="Times New Roman"/>
-          <w:sz w:val="24"/>
-          <w:szCs w:val="24"/>
-        </w:rPr>
-        <w:t>H1: Navigation based on persistent 4D map tokens requires fewer operations and less memory than a system that repeatedly analyzes full RGB and IR sequences.</w:t>
-      </w:r>
-    </w:p>
-    <w:p>
-      <w:pPr>
-        <w:spacing w:after="120" w:line="240" w:lineRule="auto"/>
-        <w:jc w:val="both"/>
-        <w:rPr>
-          <w:rFonts w:ascii="Times New Roman" w:hAnsi="Times New Roman" w:cs="Times New Roman"/>
-          <w:sz w:val="24"/>
-          <w:szCs w:val="24"/>
-        </w:rPr>
-      </w:pPr>
-      <w:r>
-        <w:rPr>
-          <w:rFonts w:ascii="Times New Roman" w:eastAsia="Times New Roman" w:hAnsi="Times New Roman" w:cs="Times New Roman"/>
-          <w:sz w:val="24"/>
-          <w:szCs w:val="24"/>
-        </w:rPr>
-        <w:t>H2: Adding semantic embeddings to the geometric SLAM map reduces re-localization error in environments containing repetitive geometric structures.</w:t>
-      </w:r>
-    </w:p>
-    <w:p>
-      <w:pPr>
-        <w:spacing w:after="120" w:line="240" w:lineRule="auto"/>
-        <w:jc w:val="both"/>
-        <w:rPr>
-          <w:rFonts w:ascii="Times New Roman" w:hAnsi="Times New Roman" w:cs="Times New Roman"/>
-          <w:sz w:val="24"/>
-          <w:szCs w:val="24"/>
-        </w:rPr>
-      </w:pPr>
-      <w:r>
-        <w:rPr>
-          <w:rFonts w:ascii="Times New Roman" w:eastAsia="Times New Roman" w:hAnsi="Times New Roman" w:cs="Times New Roman"/>
-          <w:sz w:val="24"/>
-          <w:szCs w:val="24"/>
-        </w:rPr>
-        <w:t>H3: The temporal token model improves future occupancy prediction relative to a static 3D map.</w:t>
-      </w:r>
-    </w:p>
-    <w:p>
-      <w:pPr>
-        <w:spacing w:after="120" w:line="240" w:lineRule="auto"/>
-        <w:jc w:val="both"/>
-        <w:rPr>
-          <w:rFonts w:ascii="Times New Roman" w:hAnsi="Times New Roman" w:cs="Times New Roman"/>
-          <w:sz w:val="24"/>
-          <w:szCs w:val="24"/>
-        </w:rPr>
-      </w:pPr>
-      <w:r>
-        <w:rPr>
-          <w:rFonts w:ascii="Times New Roman" w:eastAsia="Times New Roman" w:hAnsi="Times New Roman" w:cs="Times New Roman"/>
-          <w:sz w:val="24"/>
-          <w:szCs w:val="24"/>
-        </w:rPr>
-        <w:t>H4: Incorporating token uncertainty reduces the number of false responses to unconfirmed observations.</w:t>
-      </w:r>
-    </w:p>
-    <w:p>
-      <w:pPr>
-        <w:spacing w:after="120" w:line="240" w:lineRule="auto"/>
-        <w:jc w:val="both"/>
-        <w:rPr>
-          <w:rFonts w:ascii="Times New Roman" w:hAnsi="Times New Roman" w:cs="Times New Roman"/>
-          <w:sz w:val="24"/>
-          <w:szCs w:val="24"/>
-        </w:rPr>
-      </w:pPr>
-      <w:r>
-        <w:rPr>
-          <w:rFonts w:ascii="Times New Roman" w:eastAsia="Times New Roman" w:hAnsi="Times New Roman" w:cs="Times New Roman"/>
-          <w:sz w:val="24"/>
-          <w:szCs w:val="24"/>
-        </w:rPr>
-        <w:t>H5: Comparing the local token map with the reference map increases localization robustness to periodic GNSS loss or inconsistency.</w:t>
-      </w:r>
-    </w:p>
-    <w:p>
-      <w:pPr>
-        <w:spacing w:after="120" w:line="240" w:lineRule="auto"/>
-        <w:jc w:val="both"/>
-        <w:rPr>
-          <w:rFonts w:ascii="Times New Roman" w:hAnsi="Times New Roman" w:cs="Times New Roman"/>
-          <w:sz w:val="24"/>
-          <w:szCs w:val="24"/>
-        </w:rPr>
-      </w:pPr>
-      <w:r>
-        <w:rPr>
-          <w:rFonts w:ascii="Times New Roman" w:eastAsia="Times New Roman" w:hAnsi="Times New Roman" w:cs="Times New Roman"/>
-          <w:sz w:val="24"/>
-          <w:szCs w:val="24"/>
-        </w:rPr>
-        <w:t>H6: Topological descriptors of local sub-clouds improve map matching under changes in point density and partial occlusions.</w:t>
-      </w:r>
-    </w:p>
-    <w:p>
-      <w:pPr>
-        <w:spacing w:after="120" w:line="240" w:lineRule="auto"/>
-        <w:jc w:val="both"/>
-        <w:rPr>
-          <w:rFonts w:ascii="Times New Roman" w:hAnsi="Times New Roman" w:cs="Times New Roman"/>
-          <w:sz w:val="24"/>
-          <w:szCs w:val="24"/>
-        </w:rPr>
-      </w:pPr>
-      <w:r>
-        <w:rPr>
-          <w:rFonts w:ascii="Times New Roman" w:eastAsia="Times New Roman" w:hAnsi="Times New Roman" w:cs="Times New Roman"/>
-          <w:sz w:val="24"/>
-          <w:szCs w:val="24"/>
-        </w:rPr>
-        <w:t>H7: Planning using the predicted risk map increases the probability of safely completing a route in a partially observable environment.</w:t>
+      <w:pPr/>
+      <w:r>
+        <w:t>The confirmatory mechanism study uses seven preregistered hypotheses. Each hypothesis compares the full S4D-TAM model with a variant that disables exactly one mechanism while data, seeds, preprocessing, optimization budget, and all other settings remain fixed. External systems are deliberately excluded from this causal ablation family.</w:t>
+      </w:r>
+    </w:p>
+    <w:p>
+      <w:pPr/>
+      <w:r>
+        <w:t>H1: Semantics improve navigation in scenarios containing dynamic objects. The primary endpoint is mission success; collisions per kilometer and semantic mIoU are secondary outcomes.</w:t>
+      </w:r>
+    </w:p>
+    <w:p>
+      <w:pPr/>
+      <w:r>
+        <w:t>H2: Temporal state improves 1 s future-state prediction. The primary endpoint is forecast occupancy IoU at 1 s; flow EPE and temporal flip rate are secondary outcomes.</w:t>
+      </w:r>
+    </w:p>
+    <w:p>
+      <w:pPr/>
+      <w:r>
+        <w:t>H3: Calibrated uncertainty reduces navigation risk. The primary endpoint is collisions per kilometer; ECE, NLL, and near misses are secondary outcomes.</w:t>
+      </w:r>
+    </w:p>
+    <w:p>
+      <w:pPr/>
+      <w:r>
+        <w:t>H4: Topological support increases mission success. Path efficiency and ATE RMSE are secondary outcomes.</w:t>
+      </w:r>
+    </w:p>
+    <w:p>
+      <w:pPr/>
+      <w:r>
+        <w:t>H5: Reference-map support reduces localization error. The primary endpoint is ATE RMSE; RPE and final drift percentage are secondary outcomes.</w:t>
+      </w:r>
+    </w:p>
+    <w:p>
+      <w:pPr/>
+      <w:r>
+        <w:t>H6: Predictive risk modeling reduces collisions. The primary endpoint is collisions per kilometer; near misses and minimum clearance are secondary outcomes.</w:t>
+      </w:r>
+    </w:p>
+    <w:p>
+      <w:pPr/>
+      <w:r>
+        <w:t>H7: Token lifecycle management reduces computational cost without materially degrading navigation quality. Confirmation requires both lower p95 latency and non-inferior mission success with a preregistered margin of 2 percentage points; map bytes and peak RSS are secondary outcomes.</w:t>
+      </w:r>
+    </w:p>
+    <w:p>
+      <w:pPr/>
+      <w:r>
+        <w:t>H1-H6 are superiority hypotheses in the preregistered direction. H7 combines efficiency superiority with mission-success non-inferiority. The seven confirmatory decisions form one family and use the Holm procedure defined in Section 7.4.</w:t>
       </w:r>
     </w:p>
     <w:p>
@@ -10906,346 +10870,27 @@
       </w:r>
     </w:p>
     <w:p>
-      <w:pPr>
-        <w:spacing w:after="120" w:line="240" w:lineRule="auto"/>
-        <w:jc w:val="both"/>
-        <w:rPr>
-          <w:rFonts w:ascii="Times New Roman" w:hAnsi="Times New Roman" w:cs="Times New Roman"/>
-          <w:sz w:val="24"/>
-          <w:szCs w:val="24"/>
-        </w:rPr>
-      </w:pPr>
-      <w:r>
-        <w:rPr>
-          <w:rFonts w:ascii="Times New Roman" w:eastAsia="Times New Roman" w:hAnsi="Times New Roman" w:cs="Times New Roman"/>
-          <w:sz w:val="24"/>
-          <w:szCs w:val="24"/>
-        </w:rPr>
-        <w:t>For preliminary training, the following datasets can be used:</w:t>
-      </w:r>
-    </w:p>
-    <w:p>
-      <w:pPr>
-        <w:spacing w:after="80" w:line="240" w:lineRule="auto"/>
-        <w:ind w:left="360"/>
-        <w:jc w:val="both"/>
-        <w:rPr>
-          <w:rFonts w:ascii="Times New Roman" w:hAnsi="Times New Roman" w:cs="Times New Roman"/>
-          <w:sz w:val="24"/>
-          <w:szCs w:val="24"/>
-        </w:rPr>
-      </w:pPr>
-      <w:r>
-        <w:rPr>
-          <w:rFonts w:ascii="Times New Roman" w:eastAsia="Times New Roman" w:hAnsi="Times New Roman" w:cs="Times New Roman"/>
-          <w:sz w:val="24"/>
-          <w:szCs w:val="24"/>
-        </w:rPr>
-        <w:t xml:space="preserve">1. TartanAir </w:t>
-      </w:r>
-      <w:r>
-        <w:rPr>
-          <w:rFonts w:ascii="Times New Roman" w:eastAsia="Times New Roman" w:hAnsi="Times New Roman" w:cs="Times New Roman"/>
-          <w:sz w:val="24"/>
-          <w:szCs w:val="24"/>
-        </w:rPr>
-        <w:t>-</w:t>
-      </w:r>
-      <w:r>
-        <w:rPr>
-          <w:rFonts w:ascii="Times New Roman" w:eastAsia="Times New Roman" w:hAnsi="Times New Roman" w:cs="Times New Roman"/>
-          <w:sz w:val="24"/>
-          <w:szCs w:val="24"/>
-        </w:rPr>
-        <w:t xml:space="preserve"> contains RGB images, depth, segmentation, optical flow, camera poses, and LiDAR point clouds for diverse environments [24]</w:t>
-      </w:r>
-    </w:p>
-    <w:p>
-      <w:pPr>
-        <w:spacing w:after="80" w:line="240" w:lineRule="auto"/>
-        <w:ind w:left="360"/>
-        <w:jc w:val="both"/>
-        <w:rPr>
-          <w:rFonts w:ascii="Times New Roman" w:hAnsi="Times New Roman" w:cs="Times New Roman"/>
-          <w:sz w:val="24"/>
-          <w:szCs w:val="24"/>
-        </w:rPr>
-      </w:pPr>
-      <w:r>
-        <w:rPr>
-          <w:rFonts w:ascii="Times New Roman" w:eastAsia="Times New Roman" w:hAnsi="Times New Roman" w:cs="Times New Roman"/>
-          <w:sz w:val="24"/>
-          <w:szCs w:val="24"/>
-        </w:rPr>
-        <w:t xml:space="preserve">2. Blackbird </w:t>
-      </w:r>
-      <w:r>
-        <w:rPr>
-          <w:rFonts w:ascii="Times New Roman" w:eastAsia="Times New Roman" w:hAnsi="Times New Roman" w:cs="Times New Roman"/>
-          <w:sz w:val="24"/>
-          <w:szCs w:val="24"/>
-        </w:rPr>
-        <w:t>-</w:t>
-      </w:r>
-      <w:r>
-        <w:rPr>
-          <w:rFonts w:ascii="Times New Roman" w:eastAsia="Times New Roman" w:hAnsi="Times New Roman" w:cs="Times New Roman"/>
-          <w:sz w:val="24"/>
-          <w:szCs w:val="24"/>
-        </w:rPr>
-        <w:t xml:space="preserve"> suitable for evaluating perception during fast and dynamic UAV flight [44]</w:t>
-      </w:r>
-    </w:p>
-    <w:p>
-      <w:pPr>
-        <w:spacing w:after="80" w:line="240" w:lineRule="auto"/>
-        <w:ind w:left="360"/>
-        <w:jc w:val="both"/>
-        <w:rPr>
-          <w:rFonts w:ascii="Times New Roman" w:hAnsi="Times New Roman" w:cs="Times New Roman"/>
-          <w:sz w:val="24"/>
-          <w:szCs w:val="24"/>
-        </w:rPr>
-      </w:pPr>
-      <w:r>
-        <w:rPr>
-          <w:rFonts w:ascii="Times New Roman" w:eastAsia="Times New Roman" w:hAnsi="Times New Roman" w:cs="Times New Roman"/>
-          <w:sz w:val="24"/>
-          <w:szCs w:val="24"/>
-        </w:rPr>
-        <w:lastRenderedPageBreak/>
-        <w:t xml:space="preserve">3. MARSIM </w:t>
-      </w:r>
-      <w:r>
-        <w:rPr>
-          <w:rFonts w:ascii="Times New Roman" w:eastAsia="Times New Roman" w:hAnsi="Times New Roman" w:cs="Times New Roman"/>
-          <w:sz w:val="24"/>
-          <w:szCs w:val="24"/>
-        </w:rPr>
-        <w:t>-</w:t>
-      </w:r>
-      <w:r>
-        <w:rPr>
-          <w:rFonts w:ascii="Times New Roman" w:eastAsia="Times New Roman" w:hAnsi="Times New Roman" w:cs="Times New Roman"/>
-          <w:sz w:val="24"/>
-          <w:szCs w:val="24"/>
-        </w:rPr>
-        <w:t xml:space="preserve"> a lightweight realistic LiDAR-based UAV simulator [44]</w:t>
-      </w:r>
-    </w:p>
-    <w:p>
-      <w:pPr>
-        <w:spacing w:after="80" w:line="240" w:lineRule="auto"/>
-        <w:ind w:left="360"/>
-        <w:jc w:val="both"/>
-        <w:rPr>
-          <w:rFonts w:ascii="Times New Roman" w:hAnsi="Times New Roman" w:cs="Times New Roman"/>
-          <w:sz w:val="24"/>
-          <w:szCs w:val="24"/>
-        </w:rPr>
-      </w:pPr>
-      <w:r>
-        <w:rPr>
-          <w:rFonts w:ascii="Times New Roman" w:eastAsia="Times New Roman" w:hAnsi="Times New Roman" w:cs="Times New Roman"/>
-          <w:sz w:val="24"/>
-          <w:szCs w:val="24"/>
-        </w:rPr>
-        <w:t xml:space="preserve">4. Aeroverse </w:t>
-      </w:r>
-      <w:r>
-        <w:rPr>
-          <w:rFonts w:ascii="Times New Roman" w:eastAsia="Times New Roman" w:hAnsi="Times New Roman" w:cs="Times New Roman"/>
-          <w:sz w:val="24"/>
-          <w:szCs w:val="24"/>
-        </w:rPr>
-        <w:t>-</w:t>
-      </w:r>
-      <w:r>
-        <w:rPr>
-          <w:rFonts w:ascii="Times New Roman" w:eastAsia="Times New Roman" w:hAnsi="Times New Roman" w:cs="Times New Roman"/>
-          <w:sz w:val="24"/>
-          <w:szCs w:val="24"/>
-        </w:rPr>
-        <w:t xml:space="preserve"> a UAV-agent benchmark for simulation, pre-training, fine-tuning, and evaluation of world models [24]</w:t>
-      </w:r>
-    </w:p>
-    <w:p>
-      <w:pPr>
-        <w:spacing w:after="120" w:line="240" w:lineRule="auto"/>
-        <w:jc w:val="both"/>
-        <w:rPr>
-          <w:rFonts w:ascii="Times New Roman" w:hAnsi="Times New Roman" w:cs="Times New Roman"/>
-          <w:sz w:val="24"/>
-          <w:szCs w:val="24"/>
-        </w:rPr>
-      </w:pPr>
-      <w:r>
-        <w:rPr>
-          <w:rFonts w:ascii="Times New Roman" w:eastAsia="Times New Roman" w:hAnsi="Times New Roman" w:cs="Times New Roman"/>
-          <w:sz w:val="24"/>
-          <w:szCs w:val="24"/>
-        </w:rPr>
-        <w:t>The target dataset should be prepared specifically for UAVs and contain:</w:t>
-      </w:r>
-    </w:p>
-    <w:p>
-      <w:pPr>
-        <w:spacing w:after="80" w:line="240" w:lineRule="auto"/>
-        <w:ind w:left="360"/>
-        <w:jc w:val="both"/>
-        <w:rPr>
-          <w:rFonts w:ascii="Times New Roman" w:hAnsi="Times New Roman" w:cs="Times New Roman"/>
-          <w:sz w:val="24"/>
-          <w:szCs w:val="24"/>
-        </w:rPr>
-      </w:pPr>
-      <w:r>
-        <w:rPr>
-          <w:rFonts w:ascii="Times New Roman" w:eastAsia="Times New Roman" w:hAnsi="Times New Roman" w:cs="Times New Roman"/>
-          <w:sz w:val="24"/>
-          <w:szCs w:val="24"/>
-        </w:rPr>
-        <w:t>1. Synchronized RGB, IR, IMU, and GNSS</w:t>
-      </w:r>
-    </w:p>
-    <w:p>
-      <w:pPr>
-        <w:spacing w:after="80" w:line="240" w:lineRule="auto"/>
-        <w:ind w:left="360"/>
-        <w:jc w:val="both"/>
-        <w:rPr>
-          <w:rFonts w:ascii="Times New Roman" w:hAnsi="Times New Roman" w:cs="Times New Roman"/>
-          <w:sz w:val="24"/>
-          <w:szCs w:val="24"/>
-        </w:rPr>
-      </w:pPr>
-      <w:r>
-        <w:rPr>
-          <w:rFonts w:ascii="Times New Roman" w:eastAsia="Times New Roman" w:hAnsi="Times New Roman" w:cs="Times New Roman"/>
-          <w:sz w:val="24"/>
-          <w:szCs w:val="24"/>
-        </w:rPr>
-        <w:t>2. Reference trajectory</w:t>
-      </w:r>
-    </w:p>
-    <w:p>
-      <w:pPr>
-        <w:spacing w:after="80" w:line="240" w:lineRule="auto"/>
-        <w:ind w:left="360"/>
-        <w:jc w:val="both"/>
-        <w:rPr>
-          <w:rFonts w:ascii="Times New Roman" w:hAnsi="Times New Roman" w:cs="Times New Roman"/>
-          <w:sz w:val="24"/>
-          <w:szCs w:val="24"/>
-        </w:rPr>
-      </w:pPr>
-      <w:r>
-        <w:rPr>
-          <w:rFonts w:ascii="Times New Roman" w:eastAsia="Times New Roman" w:hAnsi="Times New Roman" w:cs="Times New Roman"/>
-          <w:sz w:val="24"/>
-          <w:szCs w:val="24"/>
-        </w:rPr>
-        <w:t>3. Point cloud</w:t>
-      </w:r>
-    </w:p>
-    <w:p>
-      <w:pPr>
-        <w:spacing w:after="80" w:line="240" w:lineRule="auto"/>
-        <w:ind w:left="360"/>
-        <w:jc w:val="both"/>
-        <w:rPr>
-          <w:rFonts w:ascii="Times New Roman" w:hAnsi="Times New Roman" w:cs="Times New Roman"/>
-          <w:sz w:val="24"/>
-          <w:szCs w:val="24"/>
-        </w:rPr>
-      </w:pPr>
-      <w:r>
-        <w:rPr>
-          <w:rFonts w:ascii="Times New Roman" w:eastAsia="Times New Roman" w:hAnsi="Times New Roman" w:cs="Times New Roman"/>
-          <w:sz w:val="24"/>
-          <w:szCs w:val="24"/>
-        </w:rPr>
-        <w:t>4. Elevation map</w:t>
-      </w:r>
-    </w:p>
-    <w:p>
-      <w:pPr>
-        <w:spacing w:after="80" w:line="240" w:lineRule="auto"/>
-        <w:ind w:left="360"/>
-        <w:jc w:val="both"/>
-        <w:rPr>
-          <w:rFonts w:ascii="Times New Roman" w:hAnsi="Times New Roman" w:cs="Times New Roman"/>
-          <w:sz w:val="24"/>
-          <w:szCs w:val="24"/>
-        </w:rPr>
-      </w:pPr>
-      <w:r>
-        <w:rPr>
-          <w:rFonts w:ascii="Times New Roman" w:eastAsia="Times New Roman" w:hAnsi="Times New Roman" w:cs="Times New Roman"/>
-          <w:sz w:val="24"/>
-          <w:szCs w:val="24"/>
-        </w:rPr>
-        <w:t>5. Static and dynamic labels</w:t>
-      </w:r>
-    </w:p>
-    <w:p>
-      <w:pPr>
-        <w:spacing w:after="80" w:line="240" w:lineRule="auto"/>
-        <w:ind w:left="360"/>
-        <w:jc w:val="both"/>
-        <w:rPr>
-          <w:rFonts w:ascii="Times New Roman" w:hAnsi="Times New Roman" w:cs="Times New Roman"/>
-          <w:sz w:val="24"/>
-          <w:szCs w:val="24"/>
-        </w:rPr>
-      </w:pPr>
-      <w:r>
-        <w:rPr>
-          <w:rFonts w:ascii="Times New Roman" w:eastAsia="Times New Roman" w:hAnsi="Times New Roman" w:cs="Times New Roman"/>
-          <w:sz w:val="24"/>
-          <w:szCs w:val="24"/>
-        </w:rPr>
-        <w:t>6. Visibility masks</w:t>
-      </w:r>
-    </w:p>
-    <w:p>
-      <w:pPr>
-        <w:spacing w:after="80" w:line="240" w:lineRule="auto"/>
-        <w:ind w:left="360"/>
-        <w:jc w:val="both"/>
-        <w:rPr>
-          <w:rFonts w:ascii="Times New Roman" w:hAnsi="Times New Roman" w:cs="Times New Roman"/>
-          <w:sz w:val="24"/>
-          <w:szCs w:val="24"/>
-        </w:rPr>
-      </w:pPr>
-      <w:r>
-        <w:rPr>
-          <w:rFonts w:ascii="Times New Roman" w:eastAsia="Times New Roman" w:hAnsi="Times New Roman" w:cs="Times New Roman"/>
-          <w:sz w:val="24"/>
-          <w:szCs w:val="24"/>
-        </w:rPr>
-        <w:t>7. Occluded area information</w:t>
-      </w:r>
-    </w:p>
-    <w:p>
-      <w:pPr>
-        <w:spacing w:after="80" w:line="240" w:lineRule="auto"/>
-        <w:ind w:left="360"/>
-        <w:jc w:val="both"/>
-        <w:rPr>
-          <w:rFonts w:ascii="Times New Roman" w:hAnsi="Times New Roman" w:cs="Times New Roman"/>
-          <w:sz w:val="24"/>
-          <w:szCs w:val="24"/>
-        </w:rPr>
-      </w:pPr>
-      <w:r>
-        <w:rPr>
-          <w:rFonts w:ascii="Times New Roman" w:eastAsia="Times New Roman" w:hAnsi="Times New Roman" w:cs="Times New Roman"/>
-          <w:sz w:val="24"/>
-          <w:szCs w:val="24"/>
-        </w:rPr>
-        <w:t>8. Individual sensor degradation scenarios</w:t>
+      <w:pPr/>
+      <w:r>
+        <w:t>The validation framework targets TartanAir, Blackbird, MARSIM, and AeroVerse, each converted to the common SequenceData contract with immutable source version, license record, coordinate convention, calibration metadata, and SHA-256 manifest. The cohort identifier frozen-2026-01 denotes the study cohort rather than a vendor release and must resolve to exact source versions and file hashes.</w:t>
+      </w:r>
+    </w:p>
+    <w:p>
+      <w:pPr/>
+      <w:r>
+        <w:t>Data are split at the environment or flight level, never by adjacent frames. The train split is the only source of learned weight updates; calibration is reserved for thresholds, normalization, early stopping, and uncertainty calibration; test remains inaccessible until code, artifacts, and analysis are frozen.</w:t>
+      </w:r>
+    </w:p>
+    <w:p>
+      <w:pPr/>
+      <w:r>
+        <w:t>The preregistered offline mechanism study uses 20 preselected test sequences per dataset, yielding 80 paired sequence-level units. Systems validation additionally defines 30 paired SIL scenarios with five seeds, 20 HIL scenarios with five seeds, and 20 paired controlled real-flight missions per variant when the safety gate remains open.</w:t>
+      </w:r>
+    </w:p>
+    <w:p>
+      <w:pPr/>
+      <w:r>
+        <w:t>A dedicated UAV dataset remains desirable for synchronized RGB, thermal, IMU, GNSS, point cloud, elevation/reference map, static and dynamic labels, visibility or observability masks, and controlled sensor-degradation scenarios. Metrics that require unavailable ground truth are reported as unavailable rather than silently omitted or imputed.</w:t>
       </w:r>
     </w:p>
     <w:p>
@@ -11260,851 +10905,162 @@
         </w:rPr>
       </w:pPr>
       <w:r>
-        <w:rPr>
-          <w:rFonts w:ascii="Times New Roman" w:eastAsia="Times New Roman" w:hAnsi="Times New Roman" w:cs="Times New Roman"/>
+        <w:t>7.2. Two-Level Comparison Design</w:t>
+      </w:r>
+    </w:p>
+    <w:p>
+      <w:pPr/>
+      <w:r>
+        <w:t>The evaluation is split into two non-interchangeable levels. Both levels use common dataset and metric contracts where applicable, but they answer different scientific questions and produce separate statistical reports.</w:t>
+      </w:r>
+    </w:p>
+    <w:p>
+      <w:pPr/>
+      <w:r>
+        <w:rPr>
+          <w:rFonts w:ascii="Times New Roman" w:hAnsi="Times New Roman"/>
+          <w:b/>
+        </w:rPr>
+        <w:t>7.2.1. External System Comparison</w:t>
+      </w:r>
+    </w:p>
+    <w:p>
+      <w:pPr/>
+      <w:r>
+        <w:t>The external comparison asks whether the complete S4D-TAM system is competitive with independently implemented navigation and SLAM systems under the same data, hardware policy, sensor availability, and evaluator definitions.</w:t>
+      </w:r>
+    </w:p>
+    <w:p>
+      <w:pPr/>
+      <w:r>
+        <w:t>The mandatory primary baseline set comprises ORB-SLAM3, VINS-Mono, FAST-LIO2, and LIO-SAM. Each baseline is pinned to an upstream revision and fixed environment or container, calibration, sensor-topic mapping, loop-closure policy, warm-up policy, and hardware configuration. Results enter the benchmark only through the common AlgorithmResult artifact schema.</w:t>
+      </w:r>
+    </w:p>
+    <w:p>
+      <w:pPr/>
+      <w:r>
+        <w:t>Additional external systems may be included only when their sensing assumptions are compatible, their exact implementation can be reproduced, and their output can be normalized without method-specific post-processing. Such additions must be frozen before the external study is executed.</w:t>
+      </w:r>
+    </w:p>
+    <w:p>
+      <w:pPr/>
+      <w:r>
+        <w:t>This level measures complete-system competitiveness. A difference relative to an external baseline cannot be interpreted as the causal effect of an individual S4D-TAM component.</w:t>
+      </w:r>
+    </w:p>
+    <w:p>
+      <w:pPr/>
+      <w:r>
+        <w:rPr>
+          <w:rFonts w:ascii="Times New Roman" w:hAnsi="Times New Roman"/>
+          <w:b/>
+        </w:rPr>
+        <w:t>7.2.2. Internal Mechanism Study</w:t>
+      </w:r>
+    </w:p>
+    <w:p>
+      <w:pPr/>
+      <w:r>
+        <w:t>The internal comparison tests mechanism contribution using the full system and seven single-component ablations: H1_no_semantics, H2_no_temporal_state, H3_no_calibrated_uncertainty, H4_no_topology, H5_no_reference_map, H6_no_risk_prediction, and H7_no_token_lifecycle.</w:t>
+      </w:r>
+    </w:p>
+    <w:p>
+      <w:pPr/>
+      <w:r>
+        <w:t>Each variant differs from full by exactly one switch and uses its own frozen trained artifact. External systems never appear in this matrix. This separation prevents confounding complete-system identity with the causal effect of removing one S4D-TAM mechanism.</w:t>
+      </w:r>
+    </w:p>
+    <w:p>
+      <w:pPr>
+        <w:spacing w:before="220" w:after="100" w:line="240" w:lineRule="auto"/>
+        <w:rPr>
+          <w:rFonts w:ascii="Times New Roman" w:hAnsi="Times New Roman" w:cs="Times New Roman"/>
           <w:b/>
           <w:bCs/>
           <w:sz w:val="24"/>
           <w:szCs w:val="24"/>
         </w:rPr>
-        <w:t>7.2. System Variants</w:t>
-      </w:r>
-    </w:p>
-    <w:p>
-      <w:pPr>
-        <w:spacing w:after="120" w:line="240" w:lineRule="auto"/>
-        <w:jc w:val="both"/>
-        <w:rPr>
-          <w:rFonts w:ascii="Times New Roman" w:hAnsi="Times New Roman" w:cs="Times New Roman"/>
-          <w:sz w:val="24"/>
-          <w:szCs w:val="24"/>
-        </w:rPr>
-      </w:pPr>
-      <w:r>
-        <w:rPr>
-          <w:rFonts w:ascii="Times New Roman" w:eastAsia="Times New Roman" w:hAnsi="Times New Roman" w:cs="Times New Roman"/>
-          <w:sz w:val="24"/>
-          <w:szCs w:val="24"/>
-        </w:rPr>
-        <w:t>The experiment should include the following variants:</w:t>
-      </w:r>
-    </w:p>
-    <w:p>
-      <w:pPr>
-        <w:spacing w:after="80" w:line="240" w:lineRule="auto"/>
-        <w:ind w:left="360"/>
-        <w:jc w:val="both"/>
-        <w:rPr>
-          <w:rFonts w:ascii="Times New Roman" w:hAnsi="Times New Roman" w:cs="Times New Roman"/>
-          <w:sz w:val="24"/>
-          <w:szCs w:val="24"/>
-        </w:rPr>
-      </w:pPr>
-      <w:r>
-        <w:rPr>
-          <w:rFonts w:ascii="Times New Roman" w:eastAsia="Times New Roman" w:hAnsi="Times New Roman" w:cs="Times New Roman"/>
-          <w:sz w:val="24"/>
-          <w:szCs w:val="24"/>
-        </w:rPr>
-        <w:t>1. Baseline 1: Classical SLAM with geometric planner</w:t>
-      </w:r>
-    </w:p>
-    <w:p>
-      <w:pPr>
-        <w:spacing w:after="80" w:line="240" w:lineRule="auto"/>
-        <w:ind w:left="360"/>
-        <w:jc w:val="both"/>
-        <w:rPr>
-          <w:rFonts w:ascii="Times New Roman" w:hAnsi="Times New Roman" w:cs="Times New Roman"/>
-          <w:sz w:val="24"/>
-          <w:szCs w:val="24"/>
-        </w:rPr>
-      </w:pPr>
-      <w:r>
-        <w:rPr>
-          <w:rFonts w:ascii="Times New Roman" w:eastAsia="Times New Roman" w:hAnsi="Times New Roman" w:cs="Times New Roman"/>
-          <w:sz w:val="24"/>
-          <w:szCs w:val="24"/>
-        </w:rPr>
-        <w:t>2. Baseline 2: SLAM with semantic segmentation</w:t>
-      </w:r>
-    </w:p>
-    <w:p>
-      <w:pPr>
-        <w:spacing w:after="80" w:line="240" w:lineRule="auto"/>
-        <w:ind w:left="360"/>
-        <w:jc w:val="both"/>
-        <w:rPr>
-          <w:rFonts w:ascii="Times New Roman" w:hAnsi="Times New Roman" w:cs="Times New Roman"/>
-          <w:sz w:val="24"/>
-          <w:szCs w:val="24"/>
-        </w:rPr>
-      </w:pPr>
-      <w:r>
-        <w:rPr>
-          <w:rFonts w:ascii="Times New Roman" w:eastAsia="Times New Roman" w:hAnsi="Times New Roman" w:cs="Times New Roman"/>
-          <w:sz w:val="24"/>
-          <w:szCs w:val="24"/>
-        </w:rPr>
-        <w:t>3. Baseline 3: Raw point cloud processed by transformer</w:t>
-      </w:r>
-    </w:p>
-    <w:p>
-      <w:pPr>
-        <w:spacing w:after="80" w:line="240" w:lineRule="auto"/>
-        <w:ind w:left="360"/>
-        <w:jc w:val="both"/>
-        <w:rPr>
-          <w:rFonts w:ascii="Times New Roman" w:hAnsi="Times New Roman" w:cs="Times New Roman"/>
-          <w:sz w:val="24"/>
-          <w:szCs w:val="24"/>
-        </w:rPr>
-      </w:pPr>
-      <w:r>
-        <w:rPr>
-          <w:rFonts w:ascii="Times New Roman" w:eastAsia="Times New Roman" w:hAnsi="Times New Roman" w:cs="Times New Roman"/>
-          <w:sz w:val="24"/>
-          <w:szCs w:val="24"/>
-        </w:rPr>
-        <w:t>4. Ablation 1: 3D tokens without temporal memory</w:t>
-      </w:r>
-    </w:p>
-    <w:p>
-      <w:pPr>
-        <w:spacing w:after="80" w:line="240" w:lineRule="auto"/>
-        <w:ind w:left="360"/>
-        <w:jc w:val="both"/>
-        <w:rPr>
-          <w:rFonts w:ascii="Times New Roman" w:hAnsi="Times New Roman" w:cs="Times New Roman"/>
-          <w:sz w:val="24"/>
-          <w:szCs w:val="24"/>
-        </w:rPr>
-      </w:pPr>
-      <w:r>
-        <w:rPr>
-          <w:rFonts w:ascii="Times New Roman" w:eastAsia="Times New Roman" w:hAnsi="Times New Roman" w:cs="Times New Roman"/>
-          <w:sz w:val="24"/>
-          <w:szCs w:val="24"/>
-        </w:rPr>
-        <w:t>5. Ablation 2: 4D tokens without reference map</w:t>
-      </w:r>
-    </w:p>
-    <w:p>
-      <w:pPr>
-        <w:spacing w:after="80" w:line="240" w:lineRule="auto"/>
-        <w:ind w:left="360"/>
-        <w:jc w:val="both"/>
-        <w:rPr>
-          <w:rFonts w:ascii="Times New Roman" w:hAnsi="Times New Roman" w:cs="Times New Roman"/>
-          <w:sz w:val="24"/>
-          <w:szCs w:val="24"/>
-        </w:rPr>
-      </w:pPr>
-      <w:r>
-        <w:rPr>
-          <w:rFonts w:ascii="Times New Roman" w:eastAsia="Times New Roman" w:hAnsi="Times New Roman" w:cs="Times New Roman"/>
-          <w:sz w:val="24"/>
-          <w:szCs w:val="24"/>
-        </w:rPr>
-        <w:t>6. Ablation 3: Full system without topological descriptors</w:t>
-      </w:r>
-    </w:p>
-    <w:p>
-      <w:pPr>
-        <w:spacing w:after="80" w:line="240" w:lineRule="auto"/>
-        <w:ind w:left="360"/>
-        <w:jc w:val="both"/>
-        <w:rPr>
-          <w:rFonts w:ascii="Times New Roman" w:hAnsi="Times New Roman" w:cs="Times New Roman"/>
-          <w:sz w:val="24"/>
-          <w:szCs w:val="24"/>
-        </w:rPr>
-      </w:pPr>
-      <w:r>
-        <w:rPr>
-          <w:rFonts w:ascii="Times New Roman" w:eastAsia="Times New Roman" w:hAnsi="Times New Roman" w:cs="Times New Roman"/>
-          <w:sz w:val="24"/>
-          <w:szCs w:val="24"/>
-        </w:rPr>
-        <w:t>7. Ablation 4: Full system without uncertainty modeling</w:t>
-      </w:r>
-    </w:p>
-    <w:p>
-      <w:pPr>
-        <w:spacing w:after="80" w:line="240" w:lineRule="auto"/>
-        <w:ind w:left="360"/>
-        <w:jc w:val="both"/>
-        <w:rPr>
-          <w:rFonts w:ascii="Times New Roman" w:hAnsi="Times New Roman" w:cs="Times New Roman"/>
-          <w:sz w:val="24"/>
-          <w:szCs w:val="24"/>
-        </w:rPr>
-      </w:pPr>
-      <w:r>
-        <w:rPr>
-          <w:rFonts w:ascii="Times New Roman" w:eastAsia="Times New Roman" w:hAnsi="Times New Roman" w:cs="Times New Roman"/>
-          <w:sz w:val="24"/>
-          <w:szCs w:val="24"/>
-        </w:rPr>
-        <w:t>8. Full S4D-TAM: Full system with all components</w:t>
-      </w:r>
-    </w:p>
-    <w:p>
-      <w:pPr>
-        <w:spacing w:before="220" w:after="100" w:line="240" w:lineRule="auto"/>
-        <w:rPr>
-          <w:rFonts w:ascii="Times New Roman" w:hAnsi="Times New Roman" w:cs="Times New Roman"/>
+      </w:pPr>
+      <w:r>
+        <w:rPr>
+          <w:rFonts w:ascii="Times New Roman" w:eastAsia="Times New Roman" w:hAnsi="Times New Roman" w:cs="Times New Roman"/>
           <w:b/>
           <w:bCs/>
           <w:sz w:val="24"/>
           <w:szCs w:val="24"/>
         </w:rPr>
-      </w:pPr>
-      <w:r>
-        <w:rPr>
-          <w:rFonts w:ascii="Times New Roman" w:eastAsia="Times New Roman" w:hAnsi="Times New Roman" w:cs="Times New Roman"/>
+        <w:t>7.3. Metrics</w:t>
+      </w:r>
+    </w:p>
+    <w:p>
+      <w:pPr/>
+      <w:r>
+        <w:t>Primary endpoints are deliberately compact and preregistered: localization uses ATE RMSE after SE(3) alignment without scale; forecasting uses occupancy IoU at 1 s and, for broader characterization, 3 s; safety uses mission success and collisions per kilometer; efficiency uses p95 latency and persistent map-memory footprint.</w:t>
+      </w:r>
+    </w:p>
+    <w:p>
+      <w:pPr/>
+      <w:r>
+        <w:t>Localization and SLAM secondary metrics include RPE translation RMSE, final drift in meters and percentage of reference path length, and rotation RPE when orientation ground truth is available. Relocalization success rate, time to relocalize, and post-relocalization pose error are reported when the dataset supports those events.</w:t>
+      </w:r>
+    </w:p>
+    <w:p>
+      <w:pPr/>
+      <w:r>
+        <w:t>Semantic metrics include mIoU and macro F1. Forecasting metrics include per-horizon occupancy IoU/F1, flow EPE, Brier score, NLL, and ECE. Pose uncertainty is evaluated by NEES, 95% coverage, and NLL where covariance output is available. Risk prediction may additionally report AUROC, false-alarm rate, and miss rate.</w:t>
+      </w:r>
+    </w:p>
+    <w:p>
+      <w:pPr/>
+      <w:r>
+        <w:t>Navigation metrics include mission success, collisions per kilometer, near misses, minimum clearance, and path efficiency. Efficiency metrics include latency p95, map bytes, peak RSS, CPU time, and implementation-specific telemetry such as processed-token counts when consistently available.</w:t>
+      </w:r>
+    </w:p>
+    <w:p>
+      <w:pPr/>
+      <w:r>
+        <w:t>Scale error, embedding quality, spatial-relation accuracy, emergency replanning counts, FPS, and energy consumption may be reported as secondary or exploratory metrics when their ground truth and measurement procedure are explicitly defined. They do not become confirmatory endpoints merely because an implementation emits them.</w:t>
+      </w:r>
+    </w:p>
+    <w:p>
+      <w:pPr/>
+      <w:r>
+        <w:t>A missing metric caused by absent ground truth or absent algorithm output is recorded as unavailable. Algorithm failure, timeout, abort, or collision is not treated as a missing observation and remains visible in the safety analysis.</w:t>
+      </w:r>
+    </w:p>
+    <w:p>
+      <w:pPr/>
+      <w:r>
+        <w:rPr>
+          <w:rFonts w:ascii="Times New Roman" w:hAnsi="Times New Roman"/>
           <w:b/>
-          <w:bCs/>
-          <w:sz w:val="24"/>
-          <w:szCs w:val="24"/>
-        </w:rPr>
-        <w:t>7.3. Metrics</w:t>
-      </w:r>
-    </w:p>
-    <w:p>
-      <w:pPr>
-        <w:spacing w:after="120" w:line="240" w:lineRule="auto"/>
-        <w:jc w:val="both"/>
-        <w:rPr>
-          <w:rFonts w:ascii="Times New Roman" w:hAnsi="Times New Roman" w:cs="Times New Roman"/>
-          <w:sz w:val="24"/>
-          <w:szCs w:val="24"/>
-        </w:rPr>
-      </w:pPr>
-      <w:r>
-        <w:rPr>
-          <w:rFonts w:ascii="Times New Roman" w:eastAsia="Times New Roman" w:hAnsi="Times New Roman" w:cs="Times New Roman"/>
-          <w:sz w:val="24"/>
-          <w:szCs w:val="24"/>
-        </w:rPr>
-        <w:t>Localization and SLAM:</w:t>
-      </w:r>
-    </w:p>
-    <w:p>
-      <w:pPr>
-        <w:spacing w:after="80" w:line="240" w:lineRule="auto"/>
-        <w:ind w:left="360"/>
-        <w:jc w:val="both"/>
-        <w:rPr>
-          <w:rFonts w:ascii="Times New Roman" w:hAnsi="Times New Roman" w:cs="Times New Roman"/>
-          <w:sz w:val="24"/>
-          <w:szCs w:val="24"/>
-        </w:rPr>
-      </w:pPr>
-      <w:r>
-        <w:rPr>
-          <w:rFonts w:ascii="Times New Roman" w:eastAsia="Times New Roman" w:hAnsi="Times New Roman" w:cs="Times New Roman"/>
-          <w:sz w:val="24"/>
-          <w:szCs w:val="24"/>
-        </w:rPr>
-        <w:t>• Absolute Trajectory Error (ATE)</w:t>
-      </w:r>
-    </w:p>
-    <w:p>
-      <w:pPr>
-        <w:spacing w:after="80" w:line="240" w:lineRule="auto"/>
-        <w:ind w:left="360"/>
-        <w:jc w:val="both"/>
-        <w:rPr>
-          <w:rFonts w:ascii="Times New Roman" w:hAnsi="Times New Roman" w:cs="Times New Roman"/>
-          <w:sz w:val="24"/>
-          <w:szCs w:val="24"/>
-        </w:rPr>
-      </w:pPr>
-      <w:r>
-        <w:rPr>
-          <w:rFonts w:ascii="Times New Roman" w:eastAsia="Times New Roman" w:hAnsi="Times New Roman" w:cs="Times New Roman"/>
-          <w:sz w:val="24"/>
-          <w:szCs w:val="24"/>
-        </w:rPr>
-        <w:t>• Relative Pose Error (RPE)</w:t>
-      </w:r>
-    </w:p>
-    <w:p>
-      <w:pPr>
-        <w:spacing w:after="80" w:line="240" w:lineRule="auto"/>
-        <w:ind w:left="360"/>
-        <w:jc w:val="both"/>
-        <w:rPr>
-          <w:rFonts w:ascii="Times New Roman" w:hAnsi="Times New Roman" w:cs="Times New Roman"/>
-          <w:sz w:val="24"/>
-          <w:szCs w:val="24"/>
-        </w:rPr>
-      </w:pPr>
-      <w:r>
-        <w:rPr>
-          <w:rFonts w:ascii="Times New Roman" w:eastAsia="Times New Roman" w:hAnsi="Times New Roman" w:cs="Times New Roman"/>
-          <w:sz w:val="24"/>
-          <w:szCs w:val="24"/>
-        </w:rPr>
-        <w:t>• Scale error</w:t>
-      </w:r>
-    </w:p>
-    <w:p>
-      <w:pPr>
-        <w:spacing w:after="80" w:line="240" w:lineRule="auto"/>
-        <w:ind w:left="360"/>
-        <w:jc w:val="both"/>
-        <w:rPr>
-          <w:rFonts w:ascii="Times New Roman" w:hAnsi="Times New Roman" w:cs="Times New Roman"/>
-          <w:sz w:val="24"/>
-          <w:szCs w:val="24"/>
-        </w:rPr>
-      </w:pPr>
-      <w:r>
-        <w:rPr>
-          <w:rFonts w:ascii="Times New Roman" w:eastAsia="Times New Roman" w:hAnsi="Times New Roman" w:cs="Times New Roman"/>
-          <w:sz w:val="24"/>
-          <w:szCs w:val="24"/>
-        </w:rPr>
-        <w:t>• Localization recovery time</w:t>
-      </w:r>
-    </w:p>
-    <w:p>
-      <w:pPr>
-        <w:spacing w:after="80" w:line="240" w:lineRule="auto"/>
-        <w:ind w:left="360"/>
-        <w:jc w:val="both"/>
-        <w:rPr>
-          <w:rFonts w:ascii="Times New Roman" w:hAnsi="Times New Roman" w:cs="Times New Roman"/>
-          <w:sz w:val="24"/>
-          <w:szCs w:val="24"/>
-        </w:rPr>
-      </w:pPr>
-      <w:r>
-        <w:rPr>
-          <w:rFonts w:ascii="Times New Roman" w:eastAsia="Times New Roman" w:hAnsi="Times New Roman" w:cs="Times New Roman"/>
-          <w:sz w:val="24"/>
-          <w:szCs w:val="24"/>
-        </w:rPr>
-        <w:t>• Robustness to false loop closures</w:t>
-      </w:r>
-    </w:p>
-    <w:p>
-      <w:pPr>
-        <w:spacing w:after="120" w:line="240" w:lineRule="auto"/>
-        <w:jc w:val="both"/>
-        <w:rPr>
-          <w:rFonts w:ascii="Times New Roman" w:hAnsi="Times New Roman" w:cs="Times New Roman"/>
-          <w:sz w:val="24"/>
-          <w:szCs w:val="24"/>
-        </w:rPr>
-      </w:pPr>
-      <w:r>
-        <w:rPr>
-          <w:rFonts w:ascii="Times New Roman" w:eastAsia="Times New Roman" w:hAnsi="Times New Roman" w:cs="Times New Roman"/>
-          <w:sz w:val="24"/>
-          <w:szCs w:val="24"/>
-        </w:rPr>
-        <w:t>Semantic map:</w:t>
-      </w:r>
-    </w:p>
-    <w:p>
-      <w:pPr>
-        <w:spacing w:after="80" w:line="240" w:lineRule="auto"/>
-        <w:ind w:left="360"/>
-        <w:jc w:val="both"/>
-        <w:rPr>
-          <w:rFonts w:ascii="Times New Roman" w:hAnsi="Times New Roman" w:cs="Times New Roman"/>
-          <w:sz w:val="24"/>
-          <w:szCs w:val="24"/>
-        </w:rPr>
-      </w:pPr>
-      <w:r>
-        <w:rPr>
-          <w:rFonts w:ascii="Times New Roman" w:eastAsia="Times New Roman" w:hAnsi="Times New Roman" w:cs="Times New Roman"/>
-          <w:sz w:val="24"/>
-          <w:szCs w:val="24"/>
-        </w:rPr>
-        <w:t>• mIoU (mean Intersection over Union)</w:t>
-      </w:r>
-    </w:p>
-    <w:p>
-      <w:pPr>
-        <w:spacing w:after="80" w:line="240" w:lineRule="auto"/>
-        <w:ind w:left="360"/>
-        <w:jc w:val="both"/>
-        <w:rPr>
-          <w:rFonts w:ascii="Times New Roman" w:hAnsi="Times New Roman" w:cs="Times New Roman"/>
-          <w:sz w:val="24"/>
-          <w:szCs w:val="24"/>
-        </w:rPr>
-      </w:pPr>
-      <w:r>
-        <w:rPr>
-          <w:rFonts w:ascii="Times New Roman" w:eastAsia="Times New Roman" w:hAnsi="Times New Roman" w:cs="Times New Roman"/>
-          <w:sz w:val="24"/>
-          <w:szCs w:val="24"/>
-        </w:rPr>
-        <w:t>• Instance recognition accuracy</w:t>
-      </w:r>
-    </w:p>
-    <w:p>
-      <w:pPr>
-        <w:spacing w:after="80" w:line="240" w:lineRule="auto"/>
-        <w:ind w:left="360"/>
-        <w:jc w:val="both"/>
-        <w:rPr>
-          <w:rFonts w:ascii="Times New Roman" w:hAnsi="Times New Roman" w:cs="Times New Roman"/>
-          <w:sz w:val="24"/>
-          <w:szCs w:val="24"/>
-        </w:rPr>
-      </w:pPr>
-      <w:r>
-        <w:rPr>
-          <w:rFonts w:ascii="Times New Roman" w:eastAsia="Times New Roman" w:hAnsi="Times New Roman" w:cs="Times New Roman"/>
-          <w:sz w:val="24"/>
-          <w:szCs w:val="24"/>
-        </w:rPr>
-        <w:t>• Label stability over time</w:t>
-      </w:r>
-    </w:p>
-    <w:p>
-      <w:pPr>
-        <w:spacing w:after="80" w:line="240" w:lineRule="auto"/>
-        <w:ind w:left="360"/>
-        <w:jc w:val="both"/>
-        <w:rPr>
-          <w:rFonts w:ascii="Times New Roman" w:hAnsi="Times New Roman" w:cs="Times New Roman"/>
-          <w:sz w:val="24"/>
-          <w:szCs w:val="24"/>
-        </w:rPr>
-      </w:pPr>
-      <w:r>
-        <w:rPr>
-          <w:rFonts w:ascii="Times New Roman" w:eastAsia="Times New Roman" w:hAnsi="Times New Roman" w:cs="Times New Roman"/>
-          <w:sz w:val="24"/>
-          <w:szCs w:val="24"/>
-        </w:rPr>
-        <w:t>• Embedding quality</w:t>
-      </w:r>
-    </w:p>
-    <w:p>
-      <w:pPr>
-        <w:spacing w:after="80" w:line="240" w:lineRule="auto"/>
-        <w:ind w:left="360"/>
-        <w:jc w:val="both"/>
-        <w:rPr>
-          <w:rFonts w:ascii="Times New Roman" w:hAnsi="Times New Roman" w:cs="Times New Roman"/>
-          <w:sz w:val="24"/>
-          <w:szCs w:val="24"/>
-        </w:rPr>
-      </w:pPr>
-      <w:r>
-        <w:rPr>
-          <w:rFonts w:ascii="Times New Roman" w:eastAsia="Times New Roman" w:hAnsi="Times New Roman" w:cs="Times New Roman"/>
-          <w:sz w:val="24"/>
-          <w:szCs w:val="24"/>
-        </w:rPr>
-        <w:t>• Spatial relation accuracy</w:t>
-      </w:r>
-    </w:p>
-    <w:p>
-      <w:pPr>
-        <w:spacing w:after="120" w:line="240" w:lineRule="auto"/>
-        <w:jc w:val="both"/>
-        <w:rPr>
-          <w:rFonts w:ascii="Times New Roman" w:hAnsi="Times New Roman" w:cs="Times New Roman"/>
-          <w:sz w:val="24"/>
-          <w:szCs w:val="24"/>
-        </w:rPr>
-      </w:pPr>
-      <w:r>
-        <w:rPr>
-          <w:rFonts w:ascii="Times New Roman" w:eastAsia="Times New Roman" w:hAnsi="Times New Roman" w:cs="Times New Roman"/>
-          <w:sz w:val="24"/>
-          <w:szCs w:val="24"/>
-        </w:rPr>
-        <w:t>Prediction:</w:t>
-      </w:r>
-    </w:p>
-    <w:p>
-      <w:pPr>
-        <w:spacing w:after="80" w:line="240" w:lineRule="auto"/>
-        <w:ind w:left="360"/>
-        <w:jc w:val="both"/>
-        <w:rPr>
-          <w:rFonts w:ascii="Times New Roman" w:hAnsi="Times New Roman" w:cs="Times New Roman"/>
-          <w:sz w:val="24"/>
-          <w:szCs w:val="24"/>
-        </w:rPr>
-      </w:pPr>
-      <w:r>
-        <w:rPr>
-          <w:rFonts w:ascii="Times New Roman" w:eastAsia="Times New Roman" w:hAnsi="Times New Roman" w:cs="Times New Roman"/>
-          <w:sz w:val="24"/>
-          <w:szCs w:val="24"/>
-        </w:rPr>
-        <w:t>• Future occupancy IoU</w:t>
-      </w:r>
-    </w:p>
-    <w:p>
-      <w:pPr>
-        <w:spacing w:after="80" w:line="240" w:lineRule="auto"/>
-        <w:ind w:left="360"/>
-        <w:jc w:val="both"/>
-        <w:rPr>
-          <w:rFonts w:ascii="Times New Roman" w:hAnsi="Times New Roman" w:cs="Times New Roman"/>
-          <w:sz w:val="24"/>
-          <w:szCs w:val="24"/>
-        </w:rPr>
-      </w:pPr>
-      <w:r>
-        <w:rPr>
-          <w:rFonts w:ascii="Times New Roman" w:eastAsia="Times New Roman" w:hAnsi="Times New Roman" w:cs="Times New Roman"/>
-          <w:sz w:val="24"/>
-          <w:szCs w:val="24"/>
-        </w:rPr>
-        <w:t>• 3D flow error</w:t>
-      </w:r>
-    </w:p>
-    <w:p>
-      <w:pPr>
-        <w:spacing w:after="80" w:line="240" w:lineRule="auto"/>
-        <w:ind w:left="360"/>
-        <w:jc w:val="both"/>
-        <w:rPr>
-          <w:rFonts w:ascii="Times New Roman" w:hAnsi="Times New Roman" w:cs="Times New Roman"/>
-          <w:sz w:val="24"/>
-          <w:szCs w:val="24"/>
-        </w:rPr>
-      </w:pPr>
-      <w:r>
-        <w:rPr>
-          <w:rFonts w:ascii="Times New Roman" w:eastAsia="Times New Roman" w:hAnsi="Times New Roman" w:cs="Times New Roman"/>
-          <w:sz w:val="24"/>
-          <w:szCs w:val="24"/>
-        </w:rPr>
-        <w:lastRenderedPageBreak/>
-        <w:t>• Brier score</w:t>
-      </w:r>
-    </w:p>
-    <w:p>
-      <w:pPr>
-        <w:spacing w:after="80" w:line="240" w:lineRule="auto"/>
-        <w:ind w:left="360"/>
-        <w:jc w:val="both"/>
-        <w:rPr>
-          <w:rFonts w:ascii="Times New Roman" w:hAnsi="Times New Roman" w:cs="Times New Roman"/>
-          <w:sz w:val="24"/>
-          <w:szCs w:val="24"/>
-        </w:rPr>
-      </w:pPr>
-      <w:r>
-        <w:rPr>
-          <w:rFonts w:ascii="Times New Roman" w:eastAsia="Times New Roman" w:hAnsi="Times New Roman" w:cs="Times New Roman"/>
-          <w:sz w:val="24"/>
-          <w:szCs w:val="24"/>
-        </w:rPr>
-        <w:t>• Expected Calibration Error (ECE)</w:t>
-      </w:r>
-    </w:p>
-    <w:p>
-      <w:pPr>
-        <w:spacing w:after="80" w:line="240" w:lineRule="auto"/>
-        <w:ind w:left="360"/>
-        <w:jc w:val="both"/>
-        <w:rPr>
-          <w:rFonts w:ascii="Times New Roman" w:hAnsi="Times New Roman" w:cs="Times New Roman"/>
-          <w:sz w:val="24"/>
-          <w:szCs w:val="24"/>
-        </w:rPr>
-      </w:pPr>
-      <w:r>
-        <w:rPr>
-          <w:rFonts w:ascii="Times New Roman" w:eastAsia="Times New Roman" w:hAnsi="Times New Roman" w:cs="Times New Roman"/>
-          <w:sz w:val="24"/>
-          <w:szCs w:val="24"/>
-        </w:rPr>
-        <w:t>• Recall for elevated-risk areas</w:t>
-      </w:r>
-    </w:p>
-    <w:p>
-      <w:pPr>
-        <w:spacing w:after="120" w:line="240" w:lineRule="auto"/>
-        <w:jc w:val="both"/>
-        <w:rPr>
-          <w:rFonts w:ascii="Times New Roman" w:hAnsi="Times New Roman" w:cs="Times New Roman"/>
-          <w:sz w:val="24"/>
-          <w:szCs w:val="24"/>
-        </w:rPr>
-      </w:pPr>
-      <w:r>
-        <w:rPr>
-          <w:rFonts w:ascii="Times New Roman" w:eastAsia="Times New Roman" w:hAnsi="Times New Roman" w:cs="Times New Roman"/>
-          <w:sz w:val="24"/>
-          <w:szCs w:val="24"/>
-        </w:rPr>
-        <w:t>Navigation:</w:t>
-      </w:r>
-    </w:p>
-    <w:p>
-      <w:pPr>
-        <w:spacing w:after="80" w:line="240" w:lineRule="auto"/>
-        <w:ind w:left="360"/>
-        <w:jc w:val="both"/>
-        <w:rPr>
-          <w:rFonts w:ascii="Times New Roman" w:hAnsi="Times New Roman" w:cs="Times New Roman"/>
-          <w:sz w:val="24"/>
-          <w:szCs w:val="24"/>
-        </w:rPr>
-      </w:pPr>
-      <w:r>
-        <w:rPr>
-          <w:rFonts w:ascii="Times New Roman" w:eastAsia="Times New Roman" w:hAnsi="Times New Roman" w:cs="Times New Roman"/>
-          <w:sz w:val="24"/>
-          <w:szCs w:val="24"/>
-        </w:rPr>
-        <w:t>• Mission completion rate</w:t>
-      </w:r>
-    </w:p>
-    <w:p>
-      <w:pPr>
-        <w:spacing w:after="80" w:line="240" w:lineRule="auto"/>
-        <w:ind w:left="360"/>
-        <w:jc w:val="both"/>
-        <w:rPr>
-          <w:rFonts w:ascii="Times New Roman" w:hAnsi="Times New Roman" w:cs="Times New Roman"/>
-          <w:sz w:val="24"/>
-          <w:szCs w:val="24"/>
-        </w:rPr>
-      </w:pPr>
-      <w:r>
-        <w:rPr>
-          <w:rFonts w:ascii="Times New Roman" w:eastAsia="Times New Roman" w:hAnsi="Times New Roman" w:cs="Times New Roman"/>
-          <w:sz w:val="24"/>
-          <w:szCs w:val="24"/>
-        </w:rPr>
-        <w:t>• Number of collisions</w:t>
-      </w:r>
-    </w:p>
-    <w:p>
-      <w:pPr>
-        <w:spacing w:after="80" w:line="240" w:lineRule="auto"/>
-        <w:ind w:left="360"/>
-        <w:jc w:val="both"/>
-        <w:rPr>
-          <w:rFonts w:ascii="Times New Roman" w:hAnsi="Times New Roman" w:cs="Times New Roman"/>
-          <w:sz w:val="24"/>
-          <w:szCs w:val="24"/>
-        </w:rPr>
-      </w:pPr>
-      <w:r>
-        <w:rPr>
-          <w:rFonts w:ascii="Times New Roman" w:eastAsia="Times New Roman" w:hAnsi="Times New Roman" w:cs="Times New Roman"/>
-          <w:sz w:val="24"/>
-          <w:szCs w:val="24"/>
-        </w:rPr>
-        <w:t>• Minimum obstacle clearance</w:t>
-      </w:r>
-    </w:p>
-    <w:p>
-      <w:pPr>
-        <w:spacing w:after="80" w:line="240" w:lineRule="auto"/>
-        <w:ind w:left="360"/>
-        <w:jc w:val="both"/>
-        <w:rPr>
-          <w:rFonts w:ascii="Times New Roman" w:hAnsi="Times New Roman" w:cs="Times New Roman"/>
-          <w:sz w:val="24"/>
-          <w:szCs w:val="24"/>
-        </w:rPr>
-      </w:pPr>
-      <w:r>
-        <w:rPr>
-          <w:rFonts w:ascii="Times New Roman" w:eastAsia="Times New Roman" w:hAnsi="Times New Roman" w:cs="Times New Roman"/>
-          <w:sz w:val="24"/>
-          <w:szCs w:val="24"/>
-        </w:rPr>
-        <w:t>• Trajectory length and time</w:t>
-      </w:r>
-    </w:p>
-    <w:p>
-      <w:pPr>
-        <w:spacing w:after="80" w:line="240" w:lineRule="auto"/>
-        <w:ind w:left="360"/>
-        <w:jc w:val="both"/>
-        <w:rPr>
-          <w:rFonts w:ascii="Times New Roman" w:hAnsi="Times New Roman" w:cs="Times New Roman"/>
-          <w:sz w:val="24"/>
-          <w:szCs w:val="24"/>
-        </w:rPr>
-      </w:pPr>
-      <w:r>
-        <w:rPr>
-          <w:rFonts w:ascii="Times New Roman" w:eastAsia="Times New Roman" w:hAnsi="Times New Roman" w:cs="Times New Roman"/>
-          <w:sz w:val="24"/>
-          <w:szCs w:val="24"/>
-        </w:rPr>
-        <w:t>• Energy cost</w:t>
-      </w:r>
-    </w:p>
-    <w:p>
-      <w:pPr>
-        <w:spacing w:after="80" w:line="240" w:lineRule="auto"/>
-        <w:ind w:left="360"/>
-        <w:jc w:val="both"/>
-        <w:rPr>
-          <w:rFonts w:ascii="Times New Roman" w:hAnsi="Times New Roman" w:cs="Times New Roman"/>
-          <w:sz w:val="24"/>
-          <w:szCs w:val="24"/>
-        </w:rPr>
-      </w:pPr>
-      <w:r>
-        <w:rPr>
-          <w:rFonts w:ascii="Times New Roman" w:eastAsia="Times New Roman" w:hAnsi="Times New Roman" w:cs="Times New Roman"/>
-          <w:sz w:val="24"/>
-          <w:szCs w:val="24"/>
-        </w:rPr>
-        <w:t>• Number of emergency replanning events</w:t>
-      </w:r>
-    </w:p>
-    <w:p>
-      <w:pPr>
-        <w:spacing w:after="120" w:line="240" w:lineRule="auto"/>
-        <w:jc w:val="both"/>
-        <w:rPr>
-          <w:rFonts w:ascii="Times New Roman" w:hAnsi="Times New Roman" w:cs="Times New Roman"/>
-          <w:sz w:val="24"/>
-          <w:szCs w:val="24"/>
-        </w:rPr>
-      </w:pPr>
-      <w:r>
-        <w:rPr>
-          <w:rFonts w:ascii="Times New Roman" w:eastAsia="Times New Roman" w:hAnsi="Times New Roman" w:cs="Times New Roman"/>
-          <w:sz w:val="24"/>
-          <w:szCs w:val="24"/>
-        </w:rPr>
-        <w:t>Computational efficiency:</w:t>
-      </w:r>
-    </w:p>
-    <w:p>
-      <w:pPr>
-        <w:spacing w:after="80" w:line="240" w:lineRule="auto"/>
-        <w:ind w:left="360"/>
-        <w:jc w:val="both"/>
-        <w:rPr>
-          <w:rFonts w:ascii="Times New Roman" w:hAnsi="Times New Roman" w:cs="Times New Roman"/>
-          <w:sz w:val="24"/>
-          <w:szCs w:val="24"/>
-        </w:rPr>
-      </w:pPr>
-      <w:r>
-        <w:rPr>
-          <w:rFonts w:ascii="Times New Roman" w:eastAsia="Times New Roman" w:hAnsi="Times New Roman" w:cs="Times New Roman"/>
-          <w:sz w:val="24"/>
-          <w:szCs w:val="24"/>
-        </w:rPr>
-        <w:t>• Latency</w:t>
-      </w:r>
-    </w:p>
-    <w:p>
-      <w:pPr>
-        <w:spacing w:after="80" w:line="240" w:lineRule="auto"/>
-        <w:ind w:left="360"/>
-        <w:jc w:val="both"/>
-        <w:rPr>
-          <w:rFonts w:ascii="Times New Roman" w:hAnsi="Times New Roman" w:cs="Times New Roman"/>
-          <w:sz w:val="24"/>
-          <w:szCs w:val="24"/>
-        </w:rPr>
-      </w:pPr>
-      <w:r>
-        <w:rPr>
-          <w:rFonts w:ascii="Times New Roman" w:eastAsia="Times New Roman" w:hAnsi="Times New Roman" w:cs="Times New Roman"/>
-          <w:sz w:val="24"/>
-          <w:szCs w:val="24"/>
-        </w:rPr>
-        <w:t>• Frames per second (FPS)</w:t>
-      </w:r>
-    </w:p>
-    <w:p>
-      <w:pPr>
-        <w:spacing w:after="80" w:line="240" w:lineRule="auto"/>
-        <w:ind w:left="360"/>
-        <w:jc w:val="both"/>
-        <w:rPr>
-          <w:rFonts w:ascii="Times New Roman" w:hAnsi="Times New Roman" w:cs="Times New Roman"/>
-          <w:sz w:val="24"/>
-          <w:szCs w:val="24"/>
-        </w:rPr>
-      </w:pPr>
-      <w:r>
-        <w:rPr>
-          <w:rFonts w:ascii="Times New Roman" w:eastAsia="Times New Roman" w:hAnsi="Times New Roman" w:cs="Times New Roman"/>
-          <w:sz w:val="24"/>
-          <w:szCs w:val="24"/>
-        </w:rPr>
-        <w:t>• Memory usage</w:t>
-      </w:r>
-    </w:p>
-    <w:p>
-      <w:pPr>
-        <w:spacing w:after="80" w:line="240" w:lineRule="auto"/>
-        <w:ind w:left="360"/>
-        <w:jc w:val="both"/>
-        <w:rPr>
-          <w:rFonts w:ascii="Times New Roman" w:hAnsi="Times New Roman" w:cs="Times New Roman"/>
-          <w:sz w:val="24"/>
-          <w:szCs w:val="24"/>
-        </w:rPr>
-      </w:pPr>
-      <w:r>
-        <w:rPr>
-          <w:rFonts w:ascii="Times New Roman" w:eastAsia="Times New Roman" w:hAnsi="Times New Roman" w:cs="Times New Roman"/>
-          <w:sz w:val="24"/>
-          <w:szCs w:val="24"/>
-        </w:rPr>
-        <w:t>• Energy consumption</w:t>
-      </w:r>
-    </w:p>
-    <w:p>
-      <w:pPr>
-        <w:spacing w:after="80" w:line="240" w:lineRule="auto"/>
-        <w:ind w:left="360"/>
-        <w:jc w:val="both"/>
-        <w:rPr>
-          <w:rFonts w:ascii="Times New Roman" w:hAnsi="Times New Roman" w:cs="Times New Roman"/>
-          <w:sz w:val="24"/>
-          <w:szCs w:val="24"/>
-        </w:rPr>
-      </w:pPr>
-      <w:r>
-        <w:rPr>
-          <w:rFonts w:ascii="Times New Roman" w:eastAsia="Times New Roman" w:hAnsi="Times New Roman" w:cs="Times New Roman"/>
-          <w:sz w:val="24"/>
-          <w:szCs w:val="24"/>
-        </w:rPr>
-        <w:t>• Number of processed tokens</w:t>
-      </w:r>
-    </w:p>
-    <w:p>
-      <w:pPr>
-        <w:spacing w:after="80" w:line="240" w:lineRule="auto"/>
-        <w:ind w:left="360"/>
-        <w:jc w:val="both"/>
-        <w:rPr>
-          <w:rFonts w:ascii="Times New Roman" w:hAnsi="Times New Roman" w:cs="Times New Roman"/>
-          <w:sz w:val="24"/>
-          <w:szCs w:val="24"/>
-        </w:rPr>
-      </w:pPr>
-      <w:r>
-        <w:rPr>
-          <w:rFonts w:ascii="Times New Roman" w:eastAsia="Times New Roman" w:hAnsi="Times New Roman" w:cs="Times New Roman"/>
-          <w:sz w:val="24"/>
-          <w:szCs w:val="24"/>
-        </w:rPr>
-        <w:t>• Persistent map size</w:t>
+          <w:sz w:val="24"/>
+        </w:rPr>
+        <w:t>7.4. Confirmatory Protocol and Statistical Analysis</w:t>
+      </w:r>
+    </w:p>
+    <w:p>
+      <w:pPr/>
+      <w:r>
+        <w:t>The preregistered H1-H7 study uses sequence or mission level inference rather than treating individual frames as independent samples. Continuous outcomes are summarized with paired mean differences and 95% BCa bootstrap confidence intervals using 10,000 resamples. Mission success is modeled as a paired scenario-level probability outcome, while distance-normalized event counts use Poisson or negative-binomial modeling with log distance as an offset according to the preregistered overdispersion rule.</w:t>
+      </w:r>
+    </w:p>
+    <w:p>
+      <w:pPr/>
+      <w:r>
+        <w:t>The seven H1-H7 confirmatory decisions form one family and are corrected with the sequential Holm procedure at family-wise alpha = 0.05. H1-H6 require the corrected result and confidence interval to support the predicted superiority direction. H7 additionally requires mission-success non-inferiority within 2 percentage points while improving p95 latency.</w:t>
+      </w:r>
+    </w:p>
+    <w:p>
+      <w:pPr/>
+      <w:r>
+        <w:t>No missing technical result is imputed. Aborts and algorithm failures remain in the denominator for safety outcomes; complete-case reporting is accompanied by the preregistered worst-case sensitivity analysis. Exclusions are limited to integrity failures, excessive missing timestamps, independently confirmed sensor faults, or operational constraints defined before result inspection.</w:t>
+      </w:r>
+    </w:p>
+    <w:p>
+      <w:pPr/>
+      <w:r>
+        <w:t>The external system comparison is reported separately from this H1-H7 inferential family. It uses the same frozen datasets and common evaluators, but its effect estimates describe differences between complete systems rather than component-level causal effects.</w:t>
       </w:r>
     </w:p>
     <w:p>
@@ -12510,12 +11466,7 @@
         </w:rPr>
       </w:pPr>
       <w:r>
-        <w:rPr>
-          <w:rFonts w:ascii="Times New Roman" w:eastAsia="Times New Roman" w:hAnsi="Times New Roman" w:cs="Times New Roman"/>
-          <w:sz w:val="24"/>
-          <w:szCs w:val="24"/>
-        </w:rPr>
-        <w:t>Future work should focus on implementing a system prototype, experimental validation of research hypotheses, computational efficiency optimization, and extension with additional sensor modalities (e.g., radar, ultrasound) and operational scenarios (e.g., multi-robot coordination, long-term missions).</w:t>
+        <w:t>Future work should focus on completing and training the learned S4D-TAM model, validating public-dataset converters and pinned external baselines, executing the preregistered H1-H7 mechanism study, and progressing from offline evaluation through SIL, HIL, and controlled real-flight validation. Additional engineering work includes the probabilistic DBN/particle backend, MPPI planning, adaptive octree/LOD storage, active perception, and safety-aware real-time scheduling.</w:t>
       </w:r>
     </w:p>
     <w:p>
@@ -12726,12 +11677,7 @@
         </w:rPr>
       </w:pPr>
       <w:r>
-        <w:rPr>
-          <w:rFonts w:ascii="Times New Roman" w:eastAsia="Times New Roman" w:hAnsi="Times New Roman" w:cs="Times New Roman"/>
-          <w:sz w:val="24"/>
-          <w:szCs w:val="24"/>
-        </w:rPr>
-        <w:t>Seven research hypotheses have been formulated regarding computational efficiency, localization accuracy, prediction quality, robustness to uncertainty, reference map integration, topological descriptor utility, and navigation safety. An experimental validation methodology has been proposed comprising datasets, system variants, and evaluation metrics.</w:t>
+        <w:t>Seven preregistered mechanism hypotheses have been formulated for semantics, temporal state, calibrated uncertainty, topology, reference-map support, predictive risk, and token lifecycle. Their causal full-vs-H1-H7 study is explicitly separated from the external system comparison against ORB-SLAM3, VINS-Mono, FAST-LIO2, and LIO-SAM.</w:t>
       </w:r>
     </w:p>
     <w:p>
@@ -12765,12 +11711,7 @@
         </w:rPr>
       </w:pPr>
       <w:r>
-        <w:rPr>
-          <w:rFonts w:ascii="Times New Roman" w:eastAsia="Times New Roman" w:hAnsi="Times New Roman" w:cs="Times New Roman"/>
-          <w:sz w:val="24"/>
-          <w:szCs w:val="24"/>
-        </w:rPr>
-        <w:t>1. Prototype implementation of the S4D-TAM system and experimental validation on the TartanAir, Blackbird, MARSIM, and dedicated UAV datasets.</w:t>
+        <w:t>1. Completion and training of the learned S4D-TAM model followed by two-level validation: external system comparison on TartanAir, Blackbird, MARSIM, and AeroVerse, and the preregistered internal full-vs-H1-H7 mechanism study.</w:t>
       </w:r>
     </w:p>
     <w:p>

</xml_diff>